<commit_message>
Contextualización tipos de SAAC
</commit_message>
<xml_diff>
--- a/Base de datos/Información ELA.docx
+++ b/Base de datos/Información ELA.docx
@@ -26,23 +26,7 @@
           <w:b/>
           <w:bCs/>
         </w:rPr>
-        <w:t xml:space="preserve"> para saber </w:t>
-      </w:r>
-      <w:proofErr w:type="spellStart"/>
-      <w:r>
-        <w:rPr>
-          <w:b/>
-          <w:bCs/>
-        </w:rPr>
-        <w:t>cual</w:t>
-      </w:r>
-      <w:proofErr w:type="spellEnd"/>
-      <w:r>
-        <w:rPr>
-          <w:b/>
-          <w:bCs/>
-        </w:rPr>
-        <w:t xml:space="preserve"> escoger</w:t>
+        <w:t xml:space="preserve"> para saber cual escoger</w:t>
       </w:r>
       <w:r>
         <w:rPr>
@@ -54,15 +38,7 @@
     </w:p>
     <w:p>
       <w:r>
-        <w:t>¿</w:t>
-      </w:r>
-      <w:proofErr w:type="spellStart"/>
-      <w:r>
-        <w:t>Donde</w:t>
-      </w:r>
-      <w:proofErr w:type="spellEnd"/>
-      <w:r>
-        <w:t xml:space="preserve">/cuando usará el dispositivo? </w:t>
+        <w:t xml:space="preserve">¿Donde/cuando usará el dispositivo? </w:t>
       </w:r>
     </w:p>
     <w:p>
@@ -108,21 +84,8 @@
     <w:p/>
     <w:p>
       <w:r>
-        <w:t xml:space="preserve">Incluir disponibilidad, hay algunas </w:t>
-      </w:r>
-      <w:proofErr w:type="gramStart"/>
-      <w:r>
-        <w:t>apps</w:t>
-      </w:r>
-      <w:proofErr w:type="gramEnd"/>
-      <w:r>
-        <w:t xml:space="preserve"> q solo están en </w:t>
-      </w:r>
-      <w:proofErr w:type="spellStart"/>
-      <w:r>
-        <w:t>iphone</w:t>
-      </w:r>
-      <w:proofErr w:type="spellEnd"/>
+        <w:t>Incluir disponibilidad, hay algunas apps q solo están en iphone</w:t>
+      </w:r>
       <w:r>
         <w:t xml:space="preserve"> (interoperabilidad)</w:t>
       </w:r>
@@ -135,15 +98,7 @@
     </w:p>
     <w:p>
       <w:r>
-        <w:t xml:space="preserve">SI control ocular = no → excluir </w:t>
-      </w:r>
-      <w:proofErr w:type="spellStart"/>
-      <w:r>
-        <w:t>eye</w:t>
-      </w:r>
-      <w:proofErr w:type="spellEnd"/>
-      <w:r>
-        <w:t>-tracking</w:t>
+        <w:t>SI control ocular = no → excluir eye-tracking</w:t>
       </w:r>
     </w:p>
     <w:p>
@@ -158,72 +113,37 @@
     </w:p>
     <w:p/>
     <w:p>
-      <w:proofErr w:type="gramStart"/>
       <w:r>
         <w:t>Q movimientos voluntarios puede hacer de forma fiable?</w:t>
       </w:r>
-      <w:proofErr w:type="gramEnd"/>
       <w:r>
         <w:t xml:space="preserve"> Manos/cabeza/ojos/voz/pulsador/ninguno</w:t>
       </w:r>
     </w:p>
     <w:p>
-      <w:proofErr w:type="spellStart"/>
-      <w:r>
-        <w:t>si</w:t>
-      </w:r>
-      <w:proofErr w:type="spellEnd"/>
-      <w:r>
-        <w:t xml:space="preserve"> manos no → eliminar táctiles</w:t>
-      </w:r>
-    </w:p>
-    <w:p>
-      <w:proofErr w:type="spellStart"/>
-      <w:r>
-        <w:t>si</w:t>
-      </w:r>
-      <w:proofErr w:type="spellEnd"/>
-      <w:r>
-        <w:t xml:space="preserve"> ojos no → eliminar </w:t>
-      </w:r>
-      <w:proofErr w:type="spellStart"/>
-      <w:r>
-        <w:t>eye</w:t>
-      </w:r>
-      <w:proofErr w:type="spellEnd"/>
-      <w:r>
-        <w:t xml:space="preserve"> tracking</w:t>
-      </w:r>
-    </w:p>
-    <w:p>
-      <w:proofErr w:type="spellStart"/>
-      <w:r>
-        <w:t>si</w:t>
-      </w:r>
-      <w:proofErr w:type="spellEnd"/>
-      <w:r>
-        <w:t xml:space="preserve"> voz no → eliminar voz</w:t>
-      </w:r>
-    </w:p>
-    <w:p>
-      <w:proofErr w:type="spellStart"/>
-      <w:r>
-        <w:t>si</w:t>
-      </w:r>
-      <w:proofErr w:type="spellEnd"/>
-      <w:r>
-        <w:t xml:space="preserve"> ninguno → solo BCI o interlocutor</w:t>
+      <w:r>
+        <w:t>si manos no → eliminar táctiles</w:t>
+      </w:r>
+    </w:p>
+    <w:p>
+      <w:r>
+        <w:t>si ojos no → eliminar eye tracking</w:t>
+      </w:r>
+    </w:p>
+    <w:p>
+      <w:r>
+        <w:t>si voz no → eliminar voz</w:t>
+      </w:r>
+    </w:p>
+    <w:p>
+      <w:r>
+        <w:t>si ninguno → solo BCI o interlocutor</w:t>
       </w:r>
     </w:p>
     <w:p/>
     <w:p>
-      <w:proofErr w:type="gramStart"/>
-      <w:r>
-        <w:t>Cuanto tiempo puede mantener una acción repetitiva?</w:t>
-      </w:r>
-      <w:proofErr w:type="gramEnd"/>
-      <w:r>
-        <w:t xml:space="preserve"> &lt;30s, 1-5 min, &gt;5min</w:t>
+      <w:r>
+        <w:t>Cuanto tiempo puede mantener una acción repetitiva? &lt;30s, 1-5 min, &gt;5min</w:t>
       </w:r>
     </w:p>
     <w:p>
@@ -243,13 +163,8 @@
       </w:r>
     </w:p>
     <w:p>
-      <w:proofErr w:type="gramStart"/>
-      <w:r>
-        <w:t>Puede fijar la mirada y distinguir símbolos en pantalla?</w:t>
-      </w:r>
-      <w:proofErr w:type="gramEnd"/>
-      <w:r>
-        <w:t xml:space="preserve"> Normal/dificultad leve/dificultad alta</w:t>
+      <w:r>
+        <w:t>Puede fijar la mirada y distinguir símbolos en pantalla? Normal/dificultad leve/dificultad alta</w:t>
       </w:r>
     </w:p>
     <w:p>
@@ -264,13 +179,8 @@
     </w:p>
     <w:p/>
     <w:p>
-      <w:proofErr w:type="gramStart"/>
-      <w:r>
-        <w:t>Escucha con claridad voces sintetizadas?</w:t>
-      </w:r>
-      <w:proofErr w:type="gramEnd"/>
-      <w:r>
-        <w:t xml:space="preserve"> Si/No</w:t>
+      <w:r>
+        <w:t>Escucha con claridad voces sintetizadas? Si/No</w:t>
       </w:r>
     </w:p>
     <w:p>
@@ -285,21 +195,8 @@
     </w:p>
     <w:p/>
     <w:p>
-      <w:proofErr w:type="gramStart"/>
-      <w:r>
-        <w:t>Puede elegir entre opciones?</w:t>
-      </w:r>
-      <w:proofErr w:type="gramEnd"/>
-      <w:r>
-        <w:t xml:space="preserve"> </w:t>
-      </w:r>
-      <w:proofErr w:type="gramStart"/>
-      <w:r>
-        <w:t>Puede comprender pictogramas?</w:t>
-      </w:r>
-      <w:proofErr w:type="gramEnd"/>
-      <w:r>
-        <w:t xml:space="preserve"> Puede escribir palabras</w:t>
+      <w:r>
+        <w:t>Puede elegir entre opciones? Puede comprender pictogramas? Puede escribir palabras</w:t>
       </w:r>
     </w:p>
     <w:p>
@@ -334,13 +231,8 @@
     </w:p>
     <w:p/>
     <w:p>
-      <w:proofErr w:type="gramStart"/>
-      <w:r>
-        <w:t>Debe poder comunicarse sin ayuda?</w:t>
-      </w:r>
-      <w:proofErr w:type="gramEnd"/>
-      <w:r>
-        <w:t xml:space="preserve"> </w:t>
+      <w:r>
+        <w:t xml:space="preserve">Debe poder comunicarse sin ayuda? </w:t>
       </w:r>
     </w:p>
     <w:p>
@@ -355,11 +247,9 @@
     </w:p>
     <w:p/>
     <w:p>
-      <w:proofErr w:type="gramStart"/>
       <w:r>
         <w:t>Donde lo usara principalmente?</w:t>
       </w:r>
-      <w:proofErr w:type="gramEnd"/>
     </w:p>
     <w:p>
       <w:r>
@@ -378,11 +268,9 @@
     </w:p>
     <w:p/>
     <w:p>
-      <w:proofErr w:type="gramStart"/>
       <w:r>
         <w:t>En que idioma necesita comunicarse?</w:t>
       </w:r>
-      <w:proofErr w:type="gramEnd"/>
     </w:p>
     <w:p>
       <w:r>
@@ -391,12 +279,10 @@
     </w:p>
     <w:p/>
     <w:p>
-      <w:proofErr w:type="gramStart"/>
       <w:r>
         <w:lastRenderedPageBreak/>
         <w:t>Cuanto tiempo puede dedicar a familiarizarse con el programa?</w:t>
       </w:r>
-      <w:proofErr w:type="gramEnd"/>
     </w:p>
     <w:p>
       <w:r>
@@ -415,48 +301,14 @@
     </w:p>
     <w:p/>
     <w:p>
-      <w:proofErr w:type="gramStart"/>
-      <w:r>
-        <w:t>Prefiere tecnología o papel?</w:t>
-      </w:r>
-      <w:proofErr w:type="gramEnd"/>
-      <w:r>
-        <w:t xml:space="preserve"> </w:t>
-      </w:r>
-      <w:proofErr w:type="gramStart"/>
-      <w:r>
-        <w:t>Le molesta llevar dispositivos?</w:t>
-      </w:r>
-      <w:proofErr w:type="gramEnd"/>
-      <w:r>
-        <w:t xml:space="preserve"> </w:t>
-      </w:r>
-      <w:proofErr w:type="gramStart"/>
-      <w:r>
-        <w:t>Quiere voz sintética o no?</w:t>
-      </w:r>
-      <w:proofErr w:type="gramEnd"/>
-      <w:r>
-        <w:t xml:space="preserve"> Esto no </w:t>
-      </w:r>
-      <w:proofErr w:type="gramStart"/>
-      <w:r>
-        <w:t>filtra</w:t>
-      </w:r>
-      <w:proofErr w:type="gramEnd"/>
-      <w:r>
-        <w:t xml:space="preserve"> sino que pondera</w:t>
+      <w:r>
+        <w:t>Prefiere tecnología o papel? Le molesta llevar dispositivos? Quiere voz sintética o no? Esto no filtra sino que pondera</w:t>
       </w:r>
     </w:p>
     <w:p/>
     <w:p>
-      <w:proofErr w:type="gramStart"/>
-      <w:r>
-        <w:t>manual Test</w:t>
-      </w:r>
-      <w:proofErr w:type="gramEnd"/>
-      <w:r>
-        <w:t xml:space="preserve"> COMFOR</w:t>
+      <w:r>
+        <w:t>manual Test COMFOR</w:t>
       </w:r>
       <w:r>
         <w:t xml:space="preserve">. </w:t>
@@ -726,23 +578,13 @@
       </w:r>
     </w:p>
     <w:p>
-      <w:proofErr w:type="spellStart"/>
-      <w:r>
-        <w:t>Funcion</w:t>
-      </w:r>
-      <w:proofErr w:type="spellEnd"/>
-      <w:r>
-        <w:t xml:space="preserve"> de la mano intacta</w:t>
-      </w:r>
-    </w:p>
-    <w:p>
-      <w:proofErr w:type="spellStart"/>
-      <w:r>
-        <w:t>Funcion</w:t>
-      </w:r>
-      <w:proofErr w:type="spellEnd"/>
-      <w:r>
-        <w:t xml:space="preserve"> de la mano deteriorada</w:t>
+      <w:r>
+        <w:t>Funcion de la mano intacta</w:t>
+      </w:r>
+    </w:p>
+    <w:p>
+      <w:r>
+        <w:t>Funcion de la mano deteriorada</w:t>
       </w:r>
     </w:p>
     <w:p/>
@@ -1236,13 +1078,8 @@
           <w:numId w:val="1"/>
         </w:numPr>
       </w:pPr>
-      <w:proofErr w:type="spellStart"/>
-      <w:r>
-        <w:t>Tecnologia</w:t>
-      </w:r>
-      <w:proofErr w:type="spellEnd"/>
-      <w:r>
-        <w:t xml:space="preserve"> media: Dispositivos sencillos con grabación manual de mensajes</w:t>
+      <w:r>
+        <w:t>Tecnologia media: Dispositivos sencillos con grabación manual de mensajes</w:t>
       </w:r>
     </w:p>
     <w:p>
@@ -1340,15 +1177,7 @@
         </w:numPr>
       </w:pPr>
       <w:r>
-        <w:t xml:space="preserve">Compactación semántica: </w:t>
-      </w:r>
-      <w:proofErr w:type="spellStart"/>
-      <w:r>
-        <w:t>Minspeak</w:t>
-      </w:r>
-      <w:proofErr w:type="spellEnd"/>
-      <w:r>
-        <w:t xml:space="preserve">: </w:t>
+        <w:t xml:space="preserve">Compactación semántica: Minspeak: </w:t>
       </w:r>
       <w:r>
         <w:t>Inspirado en los jeroglíficos</w:t>
@@ -1456,13 +1285,8 @@
         <w:t xml:space="preserve"> </w:t>
       </w:r>
       <w:r>
-        <w:t xml:space="preserve">en el que los pictogramas simbolizan funciones del lenguaje (“tengo que contarte algo”; “quiero hablar de otro tema”; “pasa la </w:t>
-      </w:r>
-      <w:proofErr w:type="gramStart"/>
-      <w:r>
-        <w:t>página”…</w:t>
-      </w:r>
-      <w:proofErr w:type="gramEnd"/>
+        <w:t>en el que los pictogramas simbolizan funciones del lenguaje (“tengo que contarte algo”; “quiero hablar de otro tema”; “pasa la página”…</w:t>
+      </w:r>
     </w:p>
     <w:p>
       <w:pPr>
@@ -1473,15 +1297,7 @@
         </w:numPr>
       </w:pPr>
       <w:r>
-        <w:t xml:space="preserve">Frecuencia: Palabras </w:t>
-      </w:r>
-      <w:proofErr w:type="spellStart"/>
-      <w:r>
-        <w:t>mas</w:t>
-      </w:r>
-      <w:proofErr w:type="spellEnd"/>
-      <w:r>
-        <w:t xml:space="preserve"> usadas primero</w:t>
+        <w:t>Frecuencia: Palabras mas usadas primero</w:t>
       </w:r>
     </w:p>
     <w:p>
@@ -1501,15 +1317,7 @@
         <w:t xml:space="preserve">Sistema pictográfico de la comunicación SPC: </w:t>
       </w:r>
       <w:r>
-        <w:t xml:space="preserve"> dibujos sencillos sobre las categorías gente, comida, ropa, aseo, cuerpo, salud, ocio, limpieza, cocina, hogar, lugares, trabajo, escuela, animales, transporte…, en definitiva, conceptos comunes para la comunicación cotidiana. SPC propuso la organización </w:t>
-      </w:r>
-      <w:proofErr w:type="spellStart"/>
-      <w:r>
-        <w:t>organización</w:t>
-      </w:r>
-      <w:proofErr w:type="spellEnd"/>
-      <w:r>
-        <w:t xml:space="preserve"> del vocabulario por categorías semánticas al combinar tipos de palabras (sustantivos, verbos, adjetivos) con campos semánticos (lugares, días de la semana, colegio, muebles…).</w:t>
+        <w:t> dibujos sencillos sobre las categorías gente, comida, ropa, aseo, cuerpo, salud, ocio, limpieza, cocina, hogar, lugares, trabajo, escuela, animales, transporte…, en definitiva, conceptos comunes para la comunicación cotidiana. SPC propuso la organización organización del vocabulario por categorías semánticas al combinar tipos de palabras (sustantivos, verbos, adjetivos) con campos semánticos (lugares, días de la semana, colegio, muebles…).</w:t>
       </w:r>
     </w:p>
     <w:p>
@@ -1520,13 +1328,8 @@
           <w:numId w:val="1"/>
         </w:numPr>
       </w:pPr>
-      <w:proofErr w:type="spellStart"/>
-      <w:r>
-        <w:t>Widgit</w:t>
-      </w:r>
-      <w:proofErr w:type="spellEnd"/>
-      <w:r>
-        <w:t xml:space="preserve">: </w:t>
+      <w:r>
+        <w:t xml:space="preserve">Widgit: </w:t>
       </w:r>
       <w:r>
         <w:t>al tiempo que se escribe un texto, se va asignando una imagen automáticamente a cada palabra. Hoy día hay otros traductores de texto a imagen, aunque la calidad depende del idioma y de la complejidad del mensaje</w:t>
@@ -1555,11 +1358,9 @@
           <w:numId w:val="1"/>
         </w:numPr>
       </w:pPr>
-      <w:proofErr w:type="spellStart"/>
       <w:r>
         <w:t>Symbolstix</w:t>
       </w:r>
-      <w:proofErr w:type="spellEnd"/>
       <w:r>
         <w:t xml:space="preserve">: </w:t>
       </w:r>
@@ -1740,11 +1541,9 @@
       </w:hyperlink>
     </w:p>
     <w:p>
-      <w:proofErr w:type="spellStart"/>
       <w:r>
         <w:t>Justificacion</w:t>
       </w:r>
-      <w:proofErr w:type="spellEnd"/>
     </w:p>
     <w:p>
       <w:hyperlink r:id="rId7" w:history="1">
@@ -1942,21 +1741,8 @@
       </w:r>
     </w:p>
     <w:p>
-      <w:proofErr w:type="gramStart"/>
-      <w:r>
-        <w:t>Especificar</w:t>
-      </w:r>
-      <w:proofErr w:type="gramEnd"/>
-      <w:r>
-        <w:t xml:space="preserve"> que nos centramos en los asistidos o con ayuda ya que para hablar por gestos no hace falta q nadie te diga </w:t>
-      </w:r>
-      <w:proofErr w:type="spellStart"/>
-      <w:r>
-        <w:t>na</w:t>
-      </w:r>
-      <w:proofErr w:type="spellEnd"/>
-      <w:r>
-        <w:t xml:space="preserve"> XD</w:t>
+      <w:r>
+        <w:t>Especificar que nos centramos en los asistidos o con ayuda ya que para hablar por gestos no hace falta q nadie te diga na XD</w:t>
       </w:r>
     </w:p>
     <w:p/>
@@ -3695,7 +3481,6 @@
                 <w14:ligatures w14:val="none"/>
               </w:rPr>
             </w:pPr>
-            <w:proofErr w:type="spellStart"/>
             <w:r>
               <w:rPr>
                 <w:rFonts w:ascii="Times New Roman" w:eastAsia="Times New Roman" w:hAnsi="Times New Roman" w:cs="Times New Roman"/>
@@ -3708,7 +3493,6 @@
               <w:lastRenderedPageBreak/>
               <w:t>SpeakBook</w:t>
             </w:r>
-            <w:proofErr w:type="spellEnd"/>
           </w:p>
         </w:tc>
         <w:tc>
@@ -4762,7 +4546,6 @@
                 <w14:ligatures w14:val="none"/>
               </w:rPr>
             </w:pPr>
-            <w:proofErr w:type="spellStart"/>
             <w:r>
               <w:rPr>
                 <w:rFonts w:ascii="Times New Roman" w:eastAsia="Times New Roman" w:hAnsi="Times New Roman" w:cs="Times New Roman"/>
@@ -4774,7 +4557,6 @@
               </w:rPr>
               <w:t>MegaBEE</w:t>
             </w:r>
-            <w:proofErr w:type="spellEnd"/>
           </w:p>
         </w:tc>
         <w:tc>
@@ -5296,53 +5078,16 @@
                 <w14:ligatures w14:val="none"/>
               </w:rPr>
             </w:pPr>
-            <w:proofErr w:type="gramStart"/>
-            <w:r>
-              <w:rPr>
-                <w:rFonts w:ascii="Times New Roman" w:eastAsia="Times New Roman" w:hAnsi="Times New Roman" w:cs="Times New Roman"/>
-                <w:kern w:val="0"/>
-                <w:sz w:val="14"/>
-                <w:szCs w:val="14"/>
-                <w:lang w:eastAsia="es-ES"/>
-                <w14:ligatures w14:val="none"/>
-              </w:rPr>
-              <w:t>Look</w:t>
-            </w:r>
-            <w:proofErr w:type="gramEnd"/>
-            <w:r>
-              <w:rPr>
-                <w:rFonts w:ascii="Times New Roman" w:eastAsia="Times New Roman" w:hAnsi="Times New Roman" w:cs="Times New Roman"/>
-                <w:kern w:val="0"/>
-                <w:sz w:val="14"/>
-                <w:szCs w:val="14"/>
-                <w:lang w:eastAsia="es-ES"/>
-                <w14:ligatures w14:val="none"/>
-              </w:rPr>
-              <w:t xml:space="preserve"> </w:t>
-            </w:r>
-            <w:proofErr w:type="spellStart"/>
-            <w:r>
-              <w:rPr>
-                <w:rFonts w:ascii="Times New Roman" w:eastAsia="Times New Roman" w:hAnsi="Times New Roman" w:cs="Times New Roman"/>
-                <w:kern w:val="0"/>
-                <w:sz w:val="14"/>
-                <w:szCs w:val="14"/>
-                <w:lang w:eastAsia="es-ES"/>
-                <w14:ligatures w14:val="none"/>
-              </w:rPr>
-              <w:t>to</w:t>
-            </w:r>
-            <w:proofErr w:type="spellEnd"/>
-            <w:r>
-              <w:rPr>
-                <w:rFonts w:ascii="Times New Roman" w:eastAsia="Times New Roman" w:hAnsi="Times New Roman" w:cs="Times New Roman"/>
-                <w:kern w:val="0"/>
-                <w:sz w:val="14"/>
-                <w:szCs w:val="14"/>
-                <w:lang w:eastAsia="es-ES"/>
-                <w14:ligatures w14:val="none"/>
-              </w:rPr>
-              <w:t xml:space="preserve"> Speak</w:t>
+            <w:r>
+              <w:rPr>
+                <w:rFonts w:ascii="Times New Roman" w:eastAsia="Times New Roman" w:hAnsi="Times New Roman" w:cs="Times New Roman"/>
+                <w:kern w:val="0"/>
+                <w:sz w:val="14"/>
+                <w:szCs w:val="14"/>
+                <w:lang w:eastAsia="es-ES"/>
+                <w14:ligatures w14:val="none"/>
+              </w:rPr>
+              <w:t>Look to Speak</w:t>
             </w:r>
           </w:p>
         </w:tc>
@@ -5865,7 +5610,6 @@
                 <w14:ligatures w14:val="none"/>
               </w:rPr>
             </w:pPr>
-            <w:proofErr w:type="spellStart"/>
             <w:r>
               <w:rPr>
                 <w:rFonts w:ascii="Times New Roman" w:eastAsia="Times New Roman" w:hAnsi="Times New Roman" w:cs="Times New Roman"/>
@@ -5877,61 +5621,36 @@
               </w:rPr>
               <w:t>Tallk</w:t>
             </w:r>
-            <w:proofErr w:type="spellEnd"/>
-          </w:p>
-        </w:tc>
-        <w:tc>
-          <w:tcPr>
-            <w:tcW w:w="0" w:type="auto"/>
-            <w:vAlign w:val="center"/>
-            <w:hideMark/>
-          </w:tcPr>
-          <w:p>
-            <w:pPr>
-              <w:spacing w:after="0" w:line="240" w:lineRule="auto"/>
-              <w:rPr>
-                <w:rFonts w:ascii="Times New Roman" w:eastAsia="Times New Roman" w:hAnsi="Times New Roman" w:cs="Times New Roman"/>
-                <w:kern w:val="0"/>
-                <w:sz w:val="14"/>
-                <w:szCs w:val="14"/>
-                <w:lang w:eastAsia="es-ES"/>
-                <w14:ligatures w14:val="none"/>
-              </w:rPr>
-            </w:pPr>
-            <w:r>
-              <w:rPr>
-                <w:rFonts w:ascii="Times New Roman" w:eastAsia="Times New Roman" w:hAnsi="Times New Roman" w:cs="Times New Roman"/>
-                <w:kern w:val="0"/>
-                <w:sz w:val="14"/>
-                <w:szCs w:val="14"/>
-                <w:lang w:eastAsia="es-ES"/>
-                <w14:ligatures w14:val="none"/>
-              </w:rPr>
-              <w:t xml:space="preserve">App </w:t>
-            </w:r>
-            <w:proofErr w:type="spellStart"/>
-            <w:r>
-              <w:rPr>
-                <w:rFonts w:ascii="Times New Roman" w:eastAsia="Times New Roman" w:hAnsi="Times New Roman" w:cs="Times New Roman"/>
-                <w:kern w:val="0"/>
-                <w:sz w:val="14"/>
-                <w:szCs w:val="14"/>
-                <w:lang w:eastAsia="es-ES"/>
-                <w14:ligatures w14:val="none"/>
-              </w:rPr>
-              <w:t>eye</w:t>
-            </w:r>
-            <w:proofErr w:type="spellEnd"/>
-            <w:r>
-              <w:rPr>
-                <w:rFonts w:ascii="Times New Roman" w:eastAsia="Times New Roman" w:hAnsi="Times New Roman" w:cs="Times New Roman"/>
-                <w:kern w:val="0"/>
-                <w:sz w:val="14"/>
-                <w:szCs w:val="14"/>
-                <w:lang w:eastAsia="es-ES"/>
-                <w14:ligatures w14:val="none"/>
-              </w:rPr>
-              <w:t>-tracking</w:t>
+          </w:p>
+        </w:tc>
+        <w:tc>
+          <w:tcPr>
+            <w:tcW w:w="0" w:type="auto"/>
+            <w:vAlign w:val="center"/>
+            <w:hideMark/>
+          </w:tcPr>
+          <w:p>
+            <w:pPr>
+              <w:spacing w:after="0" w:line="240" w:lineRule="auto"/>
+              <w:rPr>
+                <w:rFonts w:ascii="Times New Roman" w:eastAsia="Times New Roman" w:hAnsi="Times New Roman" w:cs="Times New Roman"/>
+                <w:kern w:val="0"/>
+                <w:sz w:val="14"/>
+                <w:szCs w:val="14"/>
+                <w:lang w:eastAsia="es-ES"/>
+                <w14:ligatures w14:val="none"/>
+              </w:rPr>
+            </w:pPr>
+            <w:r>
+              <w:rPr>
+                <w:rFonts w:ascii="Times New Roman" w:eastAsia="Times New Roman" w:hAnsi="Times New Roman" w:cs="Times New Roman"/>
+                <w:kern w:val="0"/>
+                <w:sz w:val="14"/>
+                <w:szCs w:val="14"/>
+                <w:lang w:eastAsia="es-ES"/>
+                <w14:ligatures w14:val="none"/>
+              </w:rPr>
+              <w:t>App eye-tracking</w:t>
             </w:r>
           </w:p>
         </w:tc>
@@ -6423,29 +6142,16 @@
                 <w14:ligatures w14:val="none"/>
               </w:rPr>
             </w:pPr>
-            <w:proofErr w:type="spellStart"/>
-            <w:r>
-              <w:rPr>
-                <w:rFonts w:ascii="Times New Roman" w:eastAsia="Times New Roman" w:hAnsi="Times New Roman" w:cs="Times New Roman"/>
-                <w:kern w:val="0"/>
-                <w:sz w:val="14"/>
-                <w:szCs w:val="14"/>
-                <w:lang w:eastAsia="es-ES"/>
-                <w14:ligatures w14:val="none"/>
-              </w:rPr>
-              <w:t>Grid</w:t>
-            </w:r>
-            <w:proofErr w:type="spellEnd"/>
-            <w:r>
-              <w:rPr>
-                <w:rFonts w:ascii="Times New Roman" w:eastAsia="Times New Roman" w:hAnsi="Times New Roman" w:cs="Times New Roman"/>
-                <w:kern w:val="0"/>
-                <w:sz w:val="14"/>
-                <w:szCs w:val="14"/>
-                <w:lang w:eastAsia="es-ES"/>
-                <w14:ligatures w14:val="none"/>
-              </w:rPr>
-              <w:t xml:space="preserve"> 3</w:t>
+            <w:r>
+              <w:rPr>
+                <w:rFonts w:ascii="Times New Roman" w:eastAsia="Times New Roman" w:hAnsi="Times New Roman" w:cs="Times New Roman"/>
+                <w:kern w:val="0"/>
+                <w:sz w:val="14"/>
+                <w:szCs w:val="14"/>
+                <w:lang w:eastAsia="es-ES"/>
+                <w14:ligatures w14:val="none"/>
+              </w:rPr>
+              <w:t>Grid 3</w:t>
             </w:r>
           </w:p>
         </w:tc>
@@ -7008,21 +6714,8 @@
                 <w:lang w:eastAsia="es-ES"/>
                 <w14:ligatures w14:val="none"/>
               </w:rPr>
-              <w:t xml:space="preserve">Comunicador </w:t>
-            </w:r>
-            <w:proofErr w:type="gramStart"/>
-            <w:r>
-              <w:rPr>
-                <w:rFonts w:ascii="Times New Roman" w:eastAsia="Times New Roman" w:hAnsi="Times New Roman" w:cs="Times New Roman"/>
-                <w:kern w:val="0"/>
-                <w:sz w:val="14"/>
-                <w:szCs w:val="14"/>
-                <w:lang w:eastAsia="es-ES"/>
-                <w14:ligatures w14:val="none"/>
-              </w:rPr>
-              <w:t>app</w:t>
-            </w:r>
-            <w:proofErr w:type="gramEnd"/>
+              <w:t>Comunicador app</w:t>
+            </w:r>
           </w:p>
         </w:tc>
         <w:tc>
@@ -7522,31 +7215,7 @@
                 <w:lang w:eastAsia="es-ES"/>
                 <w14:ligatures w14:val="none"/>
               </w:rPr>
-              <w:t xml:space="preserve">Eye </w:t>
-            </w:r>
-            <w:proofErr w:type="spellStart"/>
-            <w:r>
-              <w:rPr>
-                <w:rFonts w:ascii="Times New Roman" w:eastAsia="Times New Roman" w:hAnsi="Times New Roman" w:cs="Times New Roman"/>
-                <w:kern w:val="0"/>
-                <w:sz w:val="14"/>
-                <w:szCs w:val="14"/>
-                <w:lang w:eastAsia="es-ES"/>
-                <w14:ligatures w14:val="none"/>
-              </w:rPr>
-              <w:t>tracker</w:t>
-            </w:r>
-            <w:proofErr w:type="spellEnd"/>
-            <w:r>
-              <w:rPr>
-                <w:rFonts w:ascii="Times New Roman" w:eastAsia="Times New Roman" w:hAnsi="Times New Roman" w:cs="Times New Roman"/>
-                <w:kern w:val="0"/>
-                <w:sz w:val="14"/>
-                <w:szCs w:val="14"/>
-                <w:lang w:eastAsia="es-ES"/>
-                <w14:ligatures w14:val="none"/>
-              </w:rPr>
-              <w:t xml:space="preserve"> HW</w:t>
+              <w:t>Eye tracker HW</w:t>
             </w:r>
           </w:p>
         </w:tc>
@@ -10346,13 +10015,8 @@
           </w:tcPr>
           <w:p>
             <w:r>
-              <w:t xml:space="preserve">P </w:t>
-            </w:r>
-            <w:proofErr w:type="spellStart"/>
-            <w:r>
-              <w:t>max</w:t>
-            </w:r>
-            <w:proofErr w:type="spellEnd"/>
+              <w:t>P max</w:t>
+            </w:r>
           </w:p>
         </w:tc>
         <w:tc>
@@ -10360,11 +10024,9 @@
             <w:tcW w:w="1699" w:type="dxa"/>
           </w:tcPr>
           <w:p>
-            <w:proofErr w:type="gramStart"/>
             <w:r>
               <w:t>Link</w:t>
             </w:r>
-            <w:proofErr w:type="gramEnd"/>
           </w:p>
         </w:tc>
         <w:tc>
@@ -10471,13 +10133,8 @@
           </w:tcPr>
           <w:p>
             <w:r>
-              <w:t xml:space="preserve">Speak </w:t>
-            </w:r>
-            <w:proofErr w:type="spellStart"/>
-            <w:r>
-              <w:t>book</w:t>
-            </w:r>
-            <w:proofErr w:type="spellEnd"/>
+              <w:t>Speak book</w:t>
+            </w:r>
           </w:p>
         </w:tc>
         <w:tc>
@@ -10529,13 +10186,8 @@
               <w:t>99</w:t>
             </w:r>
             <w:r>
-              <w:t xml:space="preserve">+ </w:t>
-            </w:r>
-            <w:proofErr w:type="spellStart"/>
-            <w:r>
-              <w:t>envio</w:t>
-            </w:r>
-            <w:proofErr w:type="spellEnd"/>
+              <w:t>+ envio</w:t>
+            </w:r>
           </w:p>
         </w:tc>
         <w:tc>
@@ -10672,27 +10324,9 @@
             <w:tcW w:w="1698" w:type="dxa"/>
           </w:tcPr>
           <w:p>
-            <w:proofErr w:type="gramStart"/>
-            <w:r>
-              <w:t>Look</w:t>
-            </w:r>
-            <w:proofErr w:type="gramEnd"/>
-            <w:r>
-              <w:t xml:space="preserve"> </w:t>
-            </w:r>
-            <w:proofErr w:type="spellStart"/>
-            <w:r>
-              <w:t>to</w:t>
-            </w:r>
-            <w:proofErr w:type="spellEnd"/>
-            <w:r>
-              <w:t xml:space="preserve"> </w:t>
-            </w:r>
-            <w:proofErr w:type="spellStart"/>
-            <w:r>
-              <w:t>speak</w:t>
-            </w:r>
-            <w:proofErr w:type="spellEnd"/>
+            <w:r>
+              <w:t>Look to speak</w:t>
+            </w:r>
           </w:p>
         </w:tc>
         <w:tc>
@@ -10701,13 +10335,8 @@
           </w:tcPr>
           <w:p>
             <w:r>
-              <w:t xml:space="preserve">Gratis </w:t>
-            </w:r>
-            <w:proofErr w:type="gramStart"/>
-            <w:r>
-              <w:t>app</w:t>
-            </w:r>
-            <w:proofErr w:type="gramEnd"/>
+              <w:t>Gratis app</w:t>
+            </w:r>
           </w:p>
         </w:tc>
         <w:tc>
@@ -10735,11 +10364,9 @@
             <w:tcW w:w="1698" w:type="dxa"/>
           </w:tcPr>
           <w:p>
-            <w:proofErr w:type="spellStart"/>
             <w:r>
               <w:t>Tallk</w:t>
             </w:r>
-            <w:proofErr w:type="spellEnd"/>
           </w:p>
         </w:tc>
         <w:tc>
@@ -10748,13 +10375,8 @@
           </w:tcPr>
           <w:p>
             <w:r>
-              <w:t xml:space="preserve">Gratis </w:t>
-            </w:r>
-            <w:proofErr w:type="gramStart"/>
-            <w:r>
-              <w:t>app</w:t>
-            </w:r>
-            <w:proofErr w:type="gramEnd"/>
+              <w:t>Gratis app</w:t>
+            </w:r>
           </w:p>
         </w:tc>
         <w:tc>
@@ -10782,13 +10404,8 @@
             <w:tcW w:w="1698" w:type="dxa"/>
           </w:tcPr>
           <w:p>
-            <w:proofErr w:type="spellStart"/>
-            <w:r>
-              <w:t>Grid</w:t>
-            </w:r>
-            <w:proofErr w:type="spellEnd"/>
-            <w:r>
-              <w:t xml:space="preserve"> 3</w:t>
+            <w:r>
+              <w:t>Grid 3</w:t>
             </w:r>
           </w:p>
         </w:tc>
@@ -11121,27 +10738,9 @@
             <w:tcW w:w="1698" w:type="dxa"/>
           </w:tcPr>
           <w:p>
-            <w:proofErr w:type="gramStart"/>
-            <w:r>
-              <w:t>Look</w:t>
-            </w:r>
-            <w:proofErr w:type="gramEnd"/>
-            <w:r>
-              <w:t xml:space="preserve"> </w:t>
-            </w:r>
-            <w:proofErr w:type="spellStart"/>
-            <w:r>
-              <w:t>to</w:t>
-            </w:r>
-            <w:proofErr w:type="spellEnd"/>
-            <w:r>
-              <w:t xml:space="preserve"> </w:t>
-            </w:r>
-            <w:proofErr w:type="spellStart"/>
-            <w:r>
-              <w:t>learn</w:t>
-            </w:r>
-            <w:proofErr w:type="spellEnd"/>
+            <w:r>
+              <w:t>Look to learn</w:t>
+            </w:r>
           </w:p>
         </w:tc>
         <w:tc>
@@ -11445,13 +11044,8 @@
           </w:tcPr>
           <w:p>
             <w:r>
-              <w:t xml:space="preserve">Gratis para </w:t>
-            </w:r>
-            <w:proofErr w:type="spellStart"/>
-            <w:r>
-              <w:t>ios</w:t>
-            </w:r>
-            <w:proofErr w:type="spellEnd"/>
+              <w:t>Gratis para ios</w:t>
+            </w:r>
           </w:p>
         </w:tc>
         <w:tc>
@@ -11460,13 +11054,8 @@
           </w:tcPr>
           <w:p>
             <w:r>
-              <w:t xml:space="preserve">Gratis para </w:t>
-            </w:r>
-            <w:proofErr w:type="spellStart"/>
-            <w:r>
-              <w:t>ios</w:t>
-            </w:r>
-            <w:proofErr w:type="spellEnd"/>
+              <w:t>Gratis para ios</w:t>
+            </w:r>
           </w:p>
         </w:tc>
         <w:tc>
@@ -11497,26 +11086,12 @@
               <w:rPr>
                 <w:lang w:val="en-GB"/>
               </w:rPr>
-              <w:t xml:space="preserve">Voice </w:t>
-            </w:r>
-            <w:proofErr w:type="spellStart"/>
+              <w:t>Voice Acess/Speak to t</w:t>
+            </w:r>
             <w:r>
               <w:rPr>
                 <w:lang w:val="en-GB"/>
               </w:rPr>
-              <w:t>Acess</w:t>
-            </w:r>
-            <w:proofErr w:type="spellEnd"/>
-            <w:r>
-              <w:rPr>
-                <w:lang w:val="en-GB"/>
-              </w:rPr>
-              <w:t>/Speak to t</w:t>
-            </w:r>
-            <w:r>
-              <w:rPr>
-                <w:lang w:val="en-GB"/>
-              </w:rPr>
               <w:t>ext</w:t>
             </w:r>
           </w:p>
@@ -11527,24 +11102,11 @@
           </w:tcPr>
           <w:p>
             <w:r>
-              <w:t xml:space="preserve">Gratis uno de </w:t>
-            </w:r>
-            <w:proofErr w:type="spellStart"/>
-            <w:r>
-              <w:t>android</w:t>
-            </w:r>
-            <w:proofErr w:type="spellEnd"/>
-            <w:r>
-              <w:t xml:space="preserve"> y</w:t>
-            </w:r>
-            <w:r>
-              <w:t xml:space="preserve"> otro de </w:t>
-            </w:r>
-            <w:proofErr w:type="spellStart"/>
-            <w:r>
-              <w:t>ios</w:t>
-            </w:r>
-            <w:proofErr w:type="spellEnd"/>
+              <w:t>Gratis uno de android y</w:t>
+            </w:r>
+            <w:r>
+              <w:t xml:space="preserve"> otro de ios</w:t>
+            </w:r>
           </w:p>
         </w:tc>
         <w:tc>
@@ -11591,11 +11153,9 @@
             <w:tcW w:w="1698" w:type="dxa"/>
           </w:tcPr>
           <w:p>
-            <w:proofErr w:type="spellStart"/>
             <w:r>
               <w:t>ComuniQa</w:t>
             </w:r>
-            <w:proofErr w:type="spellEnd"/>
           </w:p>
         </w:tc>
         <w:tc>
@@ -11802,6 +11362,420 @@
     </w:tbl>
     <w:p/>
     <w:p/>
+    <w:p>
+      <w:hyperlink r:id="rId19" w:history="1">
+        <w:r>
+          <w:rPr>
+            <w:rStyle w:val="Hipervnculo"/>
+          </w:rPr>
+          <w:t>https://elibro.net/es/ereader/ubu/283824?page=8</w:t>
+        </w:r>
+      </w:hyperlink>
+      <w:r>
+        <w:t xml:space="preserve"> </w:t>
+      </w:r>
+    </w:p>
+    <w:p>
+      <w:pPr>
+        <w:rPr>
+          <w:b/>
+          <w:bCs/>
+        </w:rPr>
+      </w:pPr>
+      <w:r>
+        <w:rPr>
+          <w:b/>
+          <w:bCs/>
+        </w:rPr>
+        <w:t>Sistema BLISS:</w:t>
+      </w:r>
+    </w:p>
+    <w:p>
+      <w:pPr>
+        <w:pStyle w:val="Prrafodelista"/>
+        <w:numPr>
+          <w:ilvl w:val="0"/>
+          <w:numId w:val="12"/>
+        </w:numPr>
+      </w:pPr>
+      <w:r>
+        <w:t>Simbolos básicos como objetos, personas, acciones y cualidades</w:t>
+      </w:r>
+    </w:p>
+    <w:p>
+      <w:pPr>
+        <w:pStyle w:val="Prrafodelista"/>
+        <w:numPr>
+          <w:ilvl w:val="0"/>
+          <w:numId w:val="12"/>
+        </w:numPr>
+      </w:pPr>
+      <w:r>
+        <w:lastRenderedPageBreak/>
+        <w:t>Simbolos modificadores para representar elementos gramaticales y estructurar oraciones. Simbolos para pronombres, proposiciones, conjugaciones verbales</w:t>
+      </w:r>
+    </w:p>
+    <w:p>
+      <w:pPr>
+        <w:pStyle w:val="Prrafodelista"/>
+        <w:numPr>
+          <w:ilvl w:val="0"/>
+          <w:numId w:val="12"/>
+        </w:numPr>
+      </w:pPr>
+      <w:r>
+        <w:t>Simbolos abstractos para ideas mas complejas o no tangibles como amor, libertad, justicia o pensamiento</w:t>
+      </w:r>
+    </w:p>
+    <w:p>
+      <w:pPr>
+        <w:pStyle w:val="Prrafodelista"/>
+        <w:numPr>
+          <w:ilvl w:val="0"/>
+          <w:numId w:val="12"/>
+        </w:numPr>
+      </w:pPr>
+      <w:r>
+        <w:t>Simbolos fonéticos: Representan sonidos del lenguaje oral para ayudar a pronunciacion</w:t>
+      </w:r>
+    </w:p>
+    <w:p>
+      <w:pPr>
+        <w:pStyle w:val="Prrafodelista"/>
+        <w:numPr>
+          <w:ilvl w:val="0"/>
+          <w:numId w:val="12"/>
+        </w:numPr>
+      </w:pPr>
+      <w:r>
+        <w:t>Simbolos de categorías: Agrupar conceptos relacionados en categorías temáticas como animales, transporte, alimentos, ropa. Facilita organización y acceso</w:t>
+      </w:r>
+    </w:p>
+    <w:p>
+      <w:pPr>
+        <w:pStyle w:val="Prrafodelista"/>
+        <w:numPr>
+          <w:ilvl w:val="0"/>
+          <w:numId w:val="12"/>
+        </w:numPr>
+      </w:pPr>
+      <w:r>
+        <w:t>Simbolos numéricos para cantidades o contar</w:t>
+      </w:r>
+    </w:p>
+    <w:p>
+      <w:pPr>
+        <w:pStyle w:val="Prrafodelista"/>
+        <w:numPr>
+          <w:ilvl w:val="0"/>
+          <w:numId w:val="12"/>
+        </w:numPr>
+      </w:pPr>
+      <w:r>
+        <w:t>Simbolos direccionales para indicar direcciones</w:t>
+      </w:r>
+    </w:p>
+    <w:p>
+      <w:pPr>
+        <w:pStyle w:val="Prrafodelista"/>
+        <w:numPr>
+          <w:ilvl w:val="0"/>
+          <w:numId w:val="12"/>
+        </w:numPr>
+      </w:pPr>
+      <w:r>
+        <w:t>Simbolos de tiempo como días de la semana, meses, estaciones, momentos del día</w:t>
+      </w:r>
+    </w:p>
+    <w:p>
+      <w:pPr>
+        <w:ind w:left="360"/>
+      </w:pPr>
+      <w:r>
+        <w:t>El sistema BLISS se adapta y expande continuamente dando lugar a creación de símbolos para la representación de palabras o conceptos específicos de ciertos idiomas o culturas</w:t>
+      </w:r>
+    </w:p>
+    <w:p>
+      <w:pPr>
+        <w:pStyle w:val="Prrafodelista"/>
+        <w:numPr>
+          <w:ilvl w:val="0"/>
+          <w:numId w:val="13"/>
+        </w:numPr>
+      </w:pPr>
+      <w:r>
+        <w:t>Simbolos especiales para agregar claridad o transmitir info adicional como</w:t>
+      </w:r>
+    </w:p>
+    <w:p>
+      <w:pPr>
+        <w:pStyle w:val="Prrafodelista"/>
+        <w:numPr>
+          <w:ilvl w:val="1"/>
+          <w:numId w:val="13"/>
+        </w:numPr>
+      </w:pPr>
+      <w:r>
+        <w:t>Negación: Negacion o ausencia de un concept</w:t>
+      </w:r>
+    </w:p>
+    <w:p>
+      <w:pPr>
+        <w:pStyle w:val="Prrafodelista"/>
+        <w:numPr>
+          <w:ilvl w:val="1"/>
+          <w:numId w:val="13"/>
+        </w:numPr>
+      </w:pPr>
+      <w:r>
+        <w:t>Interrogacion: Preguntas o interrogantes</w:t>
+      </w:r>
+    </w:p>
+    <w:p>
+      <w:pPr>
+        <w:pStyle w:val="Prrafodelista"/>
+        <w:numPr>
+          <w:ilvl w:val="1"/>
+          <w:numId w:val="13"/>
+        </w:numPr>
+      </w:pPr>
+      <w:r>
+        <w:t>De acción: acciones o verbos específicos</w:t>
+      </w:r>
+    </w:p>
+    <w:p>
+      <w:pPr>
+        <w:pStyle w:val="Prrafodelista"/>
+        <w:numPr>
+          <w:ilvl w:val="1"/>
+          <w:numId w:val="13"/>
+        </w:numPr>
+      </w:pPr>
+      <w:r>
+        <w:t>Tiempo(?</w:t>
+      </w:r>
+    </w:p>
+    <w:p>
+      <w:pPr>
+        <w:pStyle w:val="Prrafodelista"/>
+        <w:numPr>
+          <w:ilvl w:val="1"/>
+          <w:numId w:val="13"/>
+        </w:numPr>
+      </w:pPr>
+      <w:r>
+        <w:t>Pausa para indicar espera en la comunicación</w:t>
+      </w:r>
+    </w:p>
+    <w:p>
+      <w:pPr>
+        <w:ind w:firstLine="708"/>
+      </w:pPr>
+      <w:r>
+        <w:t>Para usarlo hemos de tener en cuenta:</w:t>
+      </w:r>
+    </w:p>
+    <w:p>
+      <w:pPr>
+        <w:pStyle w:val="Prrafodelista"/>
+        <w:numPr>
+          <w:ilvl w:val="0"/>
+          <w:numId w:val="13"/>
+        </w:numPr>
+      </w:pPr>
+      <w:r>
+        <w:t>Conocimiento del sistema: comprensión de símbolos, su significado y estructura de composición</w:t>
+      </w:r>
+    </w:p>
+    <w:p>
+      <w:pPr>
+        <w:pStyle w:val="Prrafodelista"/>
+        <w:numPr>
+          <w:ilvl w:val="0"/>
+          <w:numId w:val="13"/>
+        </w:numPr>
+      </w:pPr>
+      <w:r>
+        <w:t>Adaptacion a las necesidades individuales: capacidades cognitivas, motoras y comunicativas</w:t>
+      </w:r>
+    </w:p>
+    <w:p>
+      <w:pPr>
+        <w:pStyle w:val="Prrafodelista"/>
+        <w:numPr>
+          <w:ilvl w:val="0"/>
+          <w:numId w:val="13"/>
+        </w:numPr>
+      </w:pPr>
+      <w:r>
+        <w:t>Acceso a una amplia gama de símbolos que sean fáciles de visualizar y manipular</w:t>
+      </w:r>
+    </w:p>
+    <w:p>
+      <w:pPr>
+        <w:pStyle w:val="Prrafodelista"/>
+        <w:numPr>
+          <w:ilvl w:val="0"/>
+          <w:numId w:val="13"/>
+        </w:numPr>
+      </w:pPr>
+      <w:r>
+        <w:t>Aprendizaje y practica. Hay que estar dispuesto a dedicar tiempo y esfuerzo</w:t>
+      </w:r>
+    </w:p>
+    <w:p>
+      <w:pPr>
+        <w:pStyle w:val="Prrafodelista"/>
+        <w:numPr>
+          <w:ilvl w:val="0"/>
+          <w:numId w:val="13"/>
+        </w:numPr>
+      </w:pPr>
+      <w:r>
+        <w:t>Apoyo y facilitación de los profesionales</w:t>
+      </w:r>
+    </w:p>
+    <w:p>
+      <w:pPr>
+        <w:pStyle w:val="Prrafodelista"/>
+        <w:numPr>
+          <w:ilvl w:val="0"/>
+          <w:numId w:val="13"/>
+        </w:numPr>
+      </w:pPr>
+      <w:r>
+        <w:t>Personalizacion y flexibilidad que se adapte a necesidades y preferencias individuales</w:t>
+      </w:r>
+    </w:p>
+    <w:p>
+      <w:pPr>
+        <w:rPr>
+          <w:b/>
+          <w:bCs/>
+        </w:rPr>
+      </w:pPr>
+      <w:r>
+        <w:rPr>
+          <w:b/>
+          <w:bCs/>
+        </w:rPr>
+        <w:t>Sistema PEC</w:t>
+      </w:r>
+    </w:p>
+    <w:p>
+      <w:r>
+        <w:t>Sistema de comunicación por intercambio de imágenes. Parece que no se aplica tanto en ELA como en niños con autismo, puede que sea algo infantilizado pero se podría valorar con personas con bajo nivel cognitivo?</w:t>
+      </w:r>
+    </w:p>
+    <w:p>
+      <w:pPr>
+        <w:rPr>
+          <w:b/>
+          <w:bCs/>
+        </w:rPr>
+      </w:pPr>
+      <w:r>
+        <w:rPr>
+          <w:b/>
+          <w:bCs/>
+        </w:rPr>
+        <w:t>Sistema SPC</w:t>
+      </w:r>
+    </w:p>
+    <w:p>
+      <w:r>
+        <w:t xml:space="preserve">3000 iconos organizados en diferentes categorías a los que se les pueden agregar más personalizados. Cada categoría esta representada por un color distinto para facilitar la comprensión (amarillo personas, verde verbos, rosa social…). Estos pictogramas son visualmente comprensibles y accesibles para personas con dificultades en el habla, lectura y escritura. La diferencia con BLISS es la forma en la que se representan visualmente los conceptos. BLISS es abstarcto y SPC concreto. En BLISS los símbolos se </w:t>
+      </w:r>
+      <w:r>
+        <w:lastRenderedPageBreak/>
+        <w:t>combinan y modifican para formar mensajes completos, en SPC se selecciona directamente el pictograma. Puede parecer que SPC en general es mas claro por los pictogramas mas intuitivos, pero puede que se quede algo corto al ser pictogramas directos y no combinación? El SPC es mas adecuado para personas con nivel expresivo simple centrado en sujeto-verbo-complemento</w:t>
+      </w:r>
+    </w:p>
+    <w:p>
+      <w:pPr>
+        <w:rPr>
+          <w:b/>
+          <w:bCs/>
+        </w:rPr>
+      </w:pPr>
+      <w:r>
+        <w:rPr>
+          <w:b/>
+          <w:bCs/>
+        </w:rPr>
+        <w:t>Lengua de signos</w:t>
+      </w:r>
+    </w:p>
+    <w:p>
+      <w:r>
+        <w:t>Requiere tiempo y dedicación para aprender y además podría haber problema de rápida degeneracion de la motilidad fina que provoque tener que cambiar rápido a otro método. Quizá no haya tiempo que dedicarle a aprender el idioma</w:t>
+      </w:r>
+    </w:p>
+    <w:p>
+      <w:pPr>
+        <w:rPr>
+          <w:b/>
+          <w:bCs/>
+        </w:rPr>
+      </w:pPr>
+      <w:r>
+        <w:rPr>
+          <w:b/>
+          <w:bCs/>
+        </w:rPr>
+        <w:t>Alfabeto dactilológico</w:t>
+      </w:r>
+    </w:p>
+    <w:p>
+      <w:r>
+        <w:t>Comunicación con personas que representan combinación de perdida auditiva y visual. Se representan las letras del alfabeto por el tacto en las manos del paciente. Cada letra tiene una ubicación especifica en la mano o dedos del comunicador de forma que la persona sordociega pueda sentir los movimientos o toques en diferentes partes de su mano para interpretar las letras correspondientes. Útil para personas con ELA y bajo nivel visual y auditivo</w:t>
+      </w:r>
+    </w:p>
+    <w:p>
+      <w:pPr>
+        <w:rPr>
+          <w:b/>
+          <w:bCs/>
+        </w:rPr>
+      </w:pPr>
+      <w:r>
+        <w:rPr>
+          <w:b/>
+          <w:bCs/>
+        </w:rPr>
+        <w:t>Sistema bimodal</w:t>
+      </w:r>
+    </w:p>
+    <w:p>
+      <w:r>
+        <w:t>Combinacion de lenguaje hablado y lengua de señas o gestos. Para personas con dificultades con el lenguaje oral</w:t>
+      </w:r>
+    </w:p>
+    <w:p>
+      <w:r>
+        <w:t>// diferencia entre oral y verbal?</w:t>
+      </w:r>
+    </w:p>
+    <w:p>
+      <w:pPr>
+        <w:rPr>
+          <w:b/>
+          <w:bCs/>
+        </w:rPr>
+      </w:pPr>
+      <w:r>
+        <w:rPr>
+          <w:b/>
+          <w:bCs/>
+        </w:rPr>
+        <w:t>Palabra completada</w:t>
+      </w:r>
+    </w:p>
+    <w:p>
+      <w:r>
+        <w:t>Lectura labial + uso de posiciones de las manos cerca de la cara</w:t>
+      </w:r>
+    </w:p>
     <w:sectPr>
       <w:pgSz w:w="11906" w:h="16838"/>
       <w:pgMar w:top="1417" w:right="1701" w:bottom="1417" w:left="1701" w:header="708" w:footer="708" w:gutter="0"/>
@@ -12152,6 +12126,119 @@
     </w:lvl>
   </w:abstractNum>
   <w:abstractNum w:abstractNumId="3" w15:restartNumberingAfterBreak="0">
+    <w:nsid w:val="1EA3004D"/>
+    <w:multiLevelType w:val="hybridMultilevel"/>
+    <w:tmpl w:val="746498C6"/>
+    <w:lvl w:ilvl="0" w:tplc="0C0A0001">
+      <w:start w:val="1"/>
+      <w:numFmt w:val="bullet"/>
+      <w:lvlText w:val=""/>
+      <w:lvlJc w:val="left"/>
+      <w:pPr>
+        <w:ind w:left="720" w:hanging="360"/>
+      </w:pPr>
+      <w:rPr>
+        <w:rFonts w:ascii="Symbol" w:hAnsi="Symbol" w:hint="default"/>
+      </w:rPr>
+    </w:lvl>
+    <w:lvl w:ilvl="1" w:tplc="0C0A0003" w:tentative="1">
+      <w:start w:val="1"/>
+      <w:numFmt w:val="bullet"/>
+      <w:lvlText w:val="o"/>
+      <w:lvlJc w:val="left"/>
+      <w:pPr>
+        <w:ind w:left="1440" w:hanging="360"/>
+      </w:pPr>
+      <w:rPr>
+        <w:rFonts w:ascii="Courier New" w:hAnsi="Courier New" w:cs="Courier New" w:hint="default"/>
+      </w:rPr>
+    </w:lvl>
+    <w:lvl w:ilvl="2" w:tplc="0C0A0005" w:tentative="1">
+      <w:start w:val="1"/>
+      <w:numFmt w:val="bullet"/>
+      <w:lvlText w:val=""/>
+      <w:lvlJc w:val="left"/>
+      <w:pPr>
+        <w:ind w:left="2160" w:hanging="360"/>
+      </w:pPr>
+      <w:rPr>
+        <w:rFonts w:ascii="Wingdings" w:hAnsi="Wingdings" w:hint="default"/>
+      </w:rPr>
+    </w:lvl>
+    <w:lvl w:ilvl="3" w:tplc="0C0A0001" w:tentative="1">
+      <w:start w:val="1"/>
+      <w:numFmt w:val="bullet"/>
+      <w:lvlText w:val=""/>
+      <w:lvlJc w:val="left"/>
+      <w:pPr>
+        <w:ind w:left="2880" w:hanging="360"/>
+      </w:pPr>
+      <w:rPr>
+        <w:rFonts w:ascii="Symbol" w:hAnsi="Symbol" w:hint="default"/>
+      </w:rPr>
+    </w:lvl>
+    <w:lvl w:ilvl="4" w:tplc="0C0A0003" w:tentative="1">
+      <w:start w:val="1"/>
+      <w:numFmt w:val="bullet"/>
+      <w:lvlText w:val="o"/>
+      <w:lvlJc w:val="left"/>
+      <w:pPr>
+        <w:ind w:left="3600" w:hanging="360"/>
+      </w:pPr>
+      <w:rPr>
+        <w:rFonts w:ascii="Courier New" w:hAnsi="Courier New" w:cs="Courier New" w:hint="default"/>
+      </w:rPr>
+    </w:lvl>
+    <w:lvl w:ilvl="5" w:tplc="0C0A0005" w:tentative="1">
+      <w:start w:val="1"/>
+      <w:numFmt w:val="bullet"/>
+      <w:lvlText w:val=""/>
+      <w:lvlJc w:val="left"/>
+      <w:pPr>
+        <w:ind w:left="4320" w:hanging="360"/>
+      </w:pPr>
+      <w:rPr>
+        <w:rFonts w:ascii="Wingdings" w:hAnsi="Wingdings" w:hint="default"/>
+      </w:rPr>
+    </w:lvl>
+    <w:lvl w:ilvl="6" w:tplc="0C0A0001" w:tentative="1">
+      <w:start w:val="1"/>
+      <w:numFmt w:val="bullet"/>
+      <w:lvlText w:val=""/>
+      <w:lvlJc w:val="left"/>
+      <w:pPr>
+        <w:ind w:left="5040" w:hanging="360"/>
+      </w:pPr>
+      <w:rPr>
+        <w:rFonts w:ascii="Symbol" w:hAnsi="Symbol" w:hint="default"/>
+      </w:rPr>
+    </w:lvl>
+    <w:lvl w:ilvl="7" w:tplc="0C0A0003" w:tentative="1">
+      <w:start w:val="1"/>
+      <w:numFmt w:val="bullet"/>
+      <w:lvlText w:val="o"/>
+      <w:lvlJc w:val="left"/>
+      <w:pPr>
+        <w:ind w:left="5760" w:hanging="360"/>
+      </w:pPr>
+      <w:rPr>
+        <w:rFonts w:ascii="Courier New" w:hAnsi="Courier New" w:cs="Courier New" w:hint="default"/>
+      </w:rPr>
+    </w:lvl>
+    <w:lvl w:ilvl="8" w:tplc="0C0A0005" w:tentative="1">
+      <w:start w:val="1"/>
+      <w:numFmt w:val="bullet"/>
+      <w:lvlText w:val=""/>
+      <w:lvlJc w:val="left"/>
+      <w:pPr>
+        <w:ind w:left="6480" w:hanging="360"/>
+      </w:pPr>
+      <w:rPr>
+        <w:rFonts w:ascii="Wingdings" w:hAnsi="Wingdings" w:hint="default"/>
+      </w:rPr>
+    </w:lvl>
+  </w:abstractNum>
+  <w:abstractNum w:abstractNumId="4" w15:restartNumberingAfterBreak="0">
     <w:nsid w:val="230405EA"/>
     <w:multiLevelType w:val="multilevel"/>
     <w:tmpl w:val="022C8FEE"/>
@@ -12264,7 +12351,7 @@
       </w:pPr>
     </w:lvl>
   </w:abstractNum>
-  <w:abstractNum w:abstractNumId="4" w15:restartNumberingAfterBreak="0">
+  <w:abstractNum w:abstractNumId="5" w15:restartNumberingAfterBreak="0">
     <w:nsid w:val="295A19CC"/>
     <w:multiLevelType w:val="multilevel"/>
     <w:tmpl w:val="A35ED4BC"/>
@@ -12413,7 +12500,7 @@
       </w:rPr>
     </w:lvl>
   </w:abstractNum>
-  <w:abstractNum w:abstractNumId="5" w15:restartNumberingAfterBreak="0">
+  <w:abstractNum w:abstractNumId="6" w15:restartNumberingAfterBreak="0">
     <w:nsid w:val="29BD6C0A"/>
     <w:multiLevelType w:val="multilevel"/>
     <w:tmpl w:val="19B223AC"/>
@@ -12562,7 +12649,7 @@
       </w:rPr>
     </w:lvl>
   </w:abstractNum>
-  <w:abstractNum w:abstractNumId="6" w15:restartNumberingAfterBreak="0">
+  <w:abstractNum w:abstractNumId="7" w15:restartNumberingAfterBreak="0">
     <w:nsid w:val="2D276EC9"/>
     <w:multiLevelType w:val="multilevel"/>
     <w:tmpl w:val="C240A346"/>
@@ -12711,7 +12798,7 @@
       </w:rPr>
     </w:lvl>
   </w:abstractNum>
-  <w:abstractNum w:abstractNumId="7" w15:restartNumberingAfterBreak="0">
+  <w:abstractNum w:abstractNumId="8" w15:restartNumberingAfterBreak="0">
     <w:nsid w:val="389B519C"/>
     <w:multiLevelType w:val="multilevel"/>
     <w:tmpl w:val="43546218"/>
@@ -12860,7 +12947,7 @@
       </w:rPr>
     </w:lvl>
   </w:abstractNum>
-  <w:abstractNum w:abstractNumId="8" w15:restartNumberingAfterBreak="0">
+  <w:abstractNum w:abstractNumId="9" w15:restartNumberingAfterBreak="0">
     <w:nsid w:val="45CF6C49"/>
     <w:multiLevelType w:val="multilevel"/>
     <w:tmpl w:val="EED60A04"/>
@@ -13009,7 +13096,120 @@
       </w:rPr>
     </w:lvl>
   </w:abstractNum>
-  <w:abstractNum w:abstractNumId="9" w15:restartNumberingAfterBreak="0">
+  <w:abstractNum w:abstractNumId="10" w15:restartNumberingAfterBreak="0">
+    <w:nsid w:val="4AEA427D"/>
+    <w:multiLevelType w:val="hybridMultilevel"/>
+    <w:tmpl w:val="2110D6F4"/>
+    <w:lvl w:ilvl="0" w:tplc="0C0A0001">
+      <w:start w:val="1"/>
+      <w:numFmt w:val="bullet"/>
+      <w:lvlText w:val=""/>
+      <w:lvlJc w:val="left"/>
+      <w:pPr>
+        <w:ind w:left="1080" w:hanging="360"/>
+      </w:pPr>
+      <w:rPr>
+        <w:rFonts w:ascii="Symbol" w:hAnsi="Symbol" w:hint="default"/>
+      </w:rPr>
+    </w:lvl>
+    <w:lvl w:ilvl="1" w:tplc="0C0A0003">
+      <w:start w:val="1"/>
+      <w:numFmt w:val="bullet"/>
+      <w:lvlText w:val="o"/>
+      <w:lvlJc w:val="left"/>
+      <w:pPr>
+        <w:ind w:left="1800" w:hanging="360"/>
+      </w:pPr>
+      <w:rPr>
+        <w:rFonts w:ascii="Courier New" w:hAnsi="Courier New" w:cs="Courier New" w:hint="default"/>
+      </w:rPr>
+    </w:lvl>
+    <w:lvl w:ilvl="2" w:tplc="0C0A0005" w:tentative="1">
+      <w:start w:val="1"/>
+      <w:numFmt w:val="bullet"/>
+      <w:lvlText w:val=""/>
+      <w:lvlJc w:val="left"/>
+      <w:pPr>
+        <w:ind w:left="2520" w:hanging="360"/>
+      </w:pPr>
+      <w:rPr>
+        <w:rFonts w:ascii="Wingdings" w:hAnsi="Wingdings" w:hint="default"/>
+      </w:rPr>
+    </w:lvl>
+    <w:lvl w:ilvl="3" w:tplc="0C0A0001" w:tentative="1">
+      <w:start w:val="1"/>
+      <w:numFmt w:val="bullet"/>
+      <w:lvlText w:val=""/>
+      <w:lvlJc w:val="left"/>
+      <w:pPr>
+        <w:ind w:left="3240" w:hanging="360"/>
+      </w:pPr>
+      <w:rPr>
+        <w:rFonts w:ascii="Symbol" w:hAnsi="Symbol" w:hint="default"/>
+      </w:rPr>
+    </w:lvl>
+    <w:lvl w:ilvl="4" w:tplc="0C0A0003" w:tentative="1">
+      <w:start w:val="1"/>
+      <w:numFmt w:val="bullet"/>
+      <w:lvlText w:val="o"/>
+      <w:lvlJc w:val="left"/>
+      <w:pPr>
+        <w:ind w:left="3960" w:hanging="360"/>
+      </w:pPr>
+      <w:rPr>
+        <w:rFonts w:ascii="Courier New" w:hAnsi="Courier New" w:cs="Courier New" w:hint="default"/>
+      </w:rPr>
+    </w:lvl>
+    <w:lvl w:ilvl="5" w:tplc="0C0A0005" w:tentative="1">
+      <w:start w:val="1"/>
+      <w:numFmt w:val="bullet"/>
+      <w:lvlText w:val=""/>
+      <w:lvlJc w:val="left"/>
+      <w:pPr>
+        <w:ind w:left="4680" w:hanging="360"/>
+      </w:pPr>
+      <w:rPr>
+        <w:rFonts w:ascii="Wingdings" w:hAnsi="Wingdings" w:hint="default"/>
+      </w:rPr>
+    </w:lvl>
+    <w:lvl w:ilvl="6" w:tplc="0C0A0001" w:tentative="1">
+      <w:start w:val="1"/>
+      <w:numFmt w:val="bullet"/>
+      <w:lvlText w:val=""/>
+      <w:lvlJc w:val="left"/>
+      <w:pPr>
+        <w:ind w:left="5400" w:hanging="360"/>
+      </w:pPr>
+      <w:rPr>
+        <w:rFonts w:ascii="Symbol" w:hAnsi="Symbol" w:hint="default"/>
+      </w:rPr>
+    </w:lvl>
+    <w:lvl w:ilvl="7" w:tplc="0C0A0003" w:tentative="1">
+      <w:start w:val="1"/>
+      <w:numFmt w:val="bullet"/>
+      <w:lvlText w:val="o"/>
+      <w:lvlJc w:val="left"/>
+      <w:pPr>
+        <w:ind w:left="6120" w:hanging="360"/>
+      </w:pPr>
+      <w:rPr>
+        <w:rFonts w:ascii="Courier New" w:hAnsi="Courier New" w:cs="Courier New" w:hint="default"/>
+      </w:rPr>
+    </w:lvl>
+    <w:lvl w:ilvl="8" w:tplc="0C0A0005" w:tentative="1">
+      <w:start w:val="1"/>
+      <w:numFmt w:val="bullet"/>
+      <w:lvlText w:val=""/>
+      <w:lvlJc w:val="left"/>
+      <w:pPr>
+        <w:ind w:left="6840" w:hanging="360"/>
+      </w:pPr>
+      <w:rPr>
+        <w:rFonts w:ascii="Wingdings" w:hAnsi="Wingdings" w:hint="default"/>
+      </w:rPr>
+    </w:lvl>
+  </w:abstractNum>
+  <w:abstractNum w:abstractNumId="11" w15:restartNumberingAfterBreak="0">
     <w:nsid w:val="4CBA44EC"/>
     <w:multiLevelType w:val="multilevel"/>
     <w:tmpl w:val="BAA291E4"/>
@@ -13158,7 +13358,7 @@
       </w:rPr>
     </w:lvl>
   </w:abstractNum>
-  <w:abstractNum w:abstractNumId="10" w15:restartNumberingAfterBreak="0">
+  <w:abstractNum w:abstractNumId="12" w15:restartNumberingAfterBreak="0">
     <w:nsid w:val="647E1076"/>
     <w:multiLevelType w:val="multilevel"/>
     <w:tmpl w:val="7AA48B52"/>
@@ -13275,34 +13475,40 @@
     <w:abstractNumId w:val="2"/>
   </w:num>
   <w:num w:numId="2" w16cid:durableId="1521965650">
-    <w:abstractNumId w:val="7"/>
+    <w:abstractNumId w:val="8"/>
   </w:num>
   <w:num w:numId="3" w16cid:durableId="734545575">
-    <w:abstractNumId w:val="10"/>
+    <w:abstractNumId w:val="12"/>
   </w:num>
   <w:num w:numId="4" w16cid:durableId="79914528">
     <w:abstractNumId w:val="1"/>
   </w:num>
   <w:num w:numId="5" w16cid:durableId="389961064">
-    <w:abstractNumId w:val="3"/>
+    <w:abstractNumId w:val="4"/>
   </w:num>
   <w:num w:numId="6" w16cid:durableId="246769104">
     <w:abstractNumId w:val="0"/>
   </w:num>
   <w:num w:numId="7" w16cid:durableId="1731076380">
+    <w:abstractNumId w:val="6"/>
+  </w:num>
+  <w:num w:numId="8" w16cid:durableId="777480799">
+    <w:abstractNumId w:val="11"/>
+  </w:num>
+  <w:num w:numId="9" w16cid:durableId="300043535">
+    <w:abstractNumId w:val="7"/>
+  </w:num>
+  <w:num w:numId="10" w16cid:durableId="1614676527">
     <w:abstractNumId w:val="5"/>
   </w:num>
-  <w:num w:numId="8" w16cid:durableId="777480799">
+  <w:num w:numId="11" w16cid:durableId="1150974729">
     <w:abstractNumId w:val="9"/>
   </w:num>
-  <w:num w:numId="9" w16cid:durableId="300043535">
-    <w:abstractNumId w:val="6"/>
+  <w:num w:numId="12" w16cid:durableId="261376292">
+    <w:abstractNumId w:val="3"/>
   </w:num>
-  <w:num w:numId="10" w16cid:durableId="1614676527">
-    <w:abstractNumId w:val="4"/>
-  </w:num>
-  <w:num w:numId="11" w16cid:durableId="1150974729">
-    <w:abstractNumId w:val="8"/>
+  <w:num w:numId="13" w16cid:durableId="1285118196">
+    <w:abstractNumId w:val="10"/>
   </w:num>
 </w:numbering>
 </file>

</xml_diff>

<commit_message>
Actualización base de datos
</commit_message>
<xml_diff>
--- a/Base de datos/Información ELA.docx
+++ b/Base de datos/Información ELA.docx
@@ -26,7 +26,23 @@
           <w:b/>
           <w:bCs/>
         </w:rPr>
-        <w:t xml:space="preserve"> para saber cual escoger</w:t>
+        <w:t xml:space="preserve"> para saber </w:t>
+      </w:r>
+      <w:proofErr w:type="spellStart"/>
+      <w:r>
+        <w:rPr>
+          <w:b/>
+          <w:bCs/>
+        </w:rPr>
+        <w:t>cual</w:t>
+      </w:r>
+      <w:proofErr w:type="spellEnd"/>
+      <w:r>
+        <w:rPr>
+          <w:b/>
+          <w:bCs/>
+        </w:rPr>
+        <w:t xml:space="preserve"> escoger</w:t>
       </w:r>
       <w:r>
         <w:rPr>
@@ -38,7 +54,15 @@
     </w:p>
     <w:p>
       <w:r>
-        <w:t xml:space="preserve">¿Donde/cuando usará el dispositivo? </w:t>
+        <w:t>¿</w:t>
+      </w:r>
+      <w:proofErr w:type="spellStart"/>
+      <w:r>
+        <w:t>Donde</w:t>
+      </w:r>
+      <w:proofErr w:type="spellEnd"/>
+      <w:r>
+        <w:t xml:space="preserve">/cuando usará el dispositivo? </w:t>
       </w:r>
     </w:p>
     <w:p>
@@ -84,8 +108,13 @@
     <w:p/>
     <w:p>
       <w:r>
-        <w:t>Incluir disponibilidad, hay algunas apps q solo están en iphone</w:t>
-      </w:r>
+        <w:t xml:space="preserve">Incluir disponibilidad, hay algunas apps q solo están en </w:t>
+      </w:r>
+      <w:proofErr w:type="spellStart"/>
+      <w:r>
+        <w:t>iphone</w:t>
+      </w:r>
+      <w:proofErr w:type="spellEnd"/>
       <w:r>
         <w:t xml:space="preserve"> (interoperabilidad)</w:t>
       </w:r>
@@ -98,7 +127,15 @@
     </w:p>
     <w:p>
       <w:r>
-        <w:t>SI control ocular = no → excluir eye-tracking</w:t>
+        <w:t xml:space="preserve">SI control ocular = no → excluir </w:t>
+      </w:r>
+      <w:proofErr w:type="spellStart"/>
+      <w:r>
+        <w:t>eye</w:t>
+      </w:r>
+      <w:proofErr w:type="spellEnd"/>
+      <w:r>
+        <w:t>-tracking</w:t>
       </w:r>
     </w:p>
     <w:p>
@@ -121,23 +158,51 @@
       </w:r>
     </w:p>
     <w:p>
-      <w:r>
-        <w:t>si manos no → eliminar táctiles</w:t>
-      </w:r>
-    </w:p>
-    <w:p>
-      <w:r>
-        <w:t>si ojos no → eliminar eye tracking</w:t>
-      </w:r>
-    </w:p>
-    <w:p>
-      <w:r>
-        <w:t>si voz no → eliminar voz</w:t>
-      </w:r>
-    </w:p>
-    <w:p>
-      <w:r>
-        <w:t>si ninguno → solo BCI o interlocutor</w:t>
+      <w:proofErr w:type="spellStart"/>
+      <w:r>
+        <w:t>si</w:t>
+      </w:r>
+      <w:proofErr w:type="spellEnd"/>
+      <w:r>
+        <w:t xml:space="preserve"> manos no → eliminar táctiles</w:t>
+      </w:r>
+    </w:p>
+    <w:p>
+      <w:proofErr w:type="spellStart"/>
+      <w:r>
+        <w:t>si</w:t>
+      </w:r>
+      <w:proofErr w:type="spellEnd"/>
+      <w:r>
+        <w:t xml:space="preserve"> ojos no → eliminar </w:t>
+      </w:r>
+      <w:proofErr w:type="spellStart"/>
+      <w:r>
+        <w:t>eye</w:t>
+      </w:r>
+      <w:proofErr w:type="spellEnd"/>
+      <w:r>
+        <w:t xml:space="preserve"> tracking</w:t>
+      </w:r>
+    </w:p>
+    <w:p>
+      <w:proofErr w:type="spellStart"/>
+      <w:r>
+        <w:t>si</w:t>
+      </w:r>
+      <w:proofErr w:type="spellEnd"/>
+      <w:r>
+        <w:t xml:space="preserve"> voz no → eliminar voz</w:t>
+      </w:r>
+    </w:p>
+    <w:p>
+      <w:proofErr w:type="spellStart"/>
+      <w:r>
+        <w:t>si</w:t>
+      </w:r>
+      <w:proofErr w:type="spellEnd"/>
+      <w:r>
+        <w:t xml:space="preserve"> ninguno → solo BCI o interlocutor</w:t>
       </w:r>
     </w:p>
     <w:p/>
@@ -578,13 +643,23 @@
       </w:r>
     </w:p>
     <w:p>
-      <w:r>
-        <w:t>Funcion de la mano intacta</w:t>
-      </w:r>
-    </w:p>
-    <w:p>
-      <w:r>
-        <w:t>Funcion de la mano deteriorada</w:t>
+      <w:proofErr w:type="spellStart"/>
+      <w:r>
+        <w:t>Funcion</w:t>
+      </w:r>
+      <w:proofErr w:type="spellEnd"/>
+      <w:r>
+        <w:t xml:space="preserve"> de la mano intacta</w:t>
+      </w:r>
+    </w:p>
+    <w:p>
+      <w:proofErr w:type="spellStart"/>
+      <w:r>
+        <w:t>Funcion</w:t>
+      </w:r>
+      <w:proofErr w:type="spellEnd"/>
+      <w:r>
+        <w:t xml:space="preserve"> de la mano deteriorada</w:t>
       </w:r>
     </w:p>
     <w:p/>
@@ -1078,8 +1153,13 @@
           <w:numId w:val="1"/>
         </w:numPr>
       </w:pPr>
-      <w:r>
-        <w:t>Tecnologia media: Dispositivos sencillos con grabación manual de mensajes</w:t>
+      <w:proofErr w:type="spellStart"/>
+      <w:r>
+        <w:t>Tecnologia</w:t>
+      </w:r>
+      <w:proofErr w:type="spellEnd"/>
+      <w:r>
+        <w:t xml:space="preserve"> media: Dispositivos sencillos con grabación manual de mensajes</w:t>
       </w:r>
     </w:p>
     <w:p>
@@ -1177,7 +1257,15 @@
         </w:numPr>
       </w:pPr>
       <w:r>
-        <w:t xml:space="preserve">Compactación semántica: Minspeak: </w:t>
+        <w:t xml:space="preserve">Compactación semántica: </w:t>
+      </w:r>
+      <w:proofErr w:type="spellStart"/>
+      <w:r>
+        <w:t>Minspeak</w:t>
+      </w:r>
+      <w:proofErr w:type="spellEnd"/>
+      <w:r>
+        <w:t xml:space="preserve">: </w:t>
       </w:r>
       <w:r>
         <w:t>Inspirado en los jeroglíficos</w:t>
@@ -1297,7 +1385,15 @@
         </w:numPr>
       </w:pPr>
       <w:r>
-        <w:t>Frecuencia: Palabras mas usadas primero</w:t>
+        <w:t xml:space="preserve">Frecuencia: Palabras </w:t>
+      </w:r>
+      <w:proofErr w:type="spellStart"/>
+      <w:r>
+        <w:t>mas</w:t>
+      </w:r>
+      <w:proofErr w:type="spellEnd"/>
+      <w:r>
+        <w:t xml:space="preserve"> usadas primero</w:t>
       </w:r>
     </w:p>
     <w:p>
@@ -1317,7 +1413,15 @@
         <w:t xml:space="preserve">Sistema pictográfico de la comunicación SPC: </w:t>
       </w:r>
       <w:r>
-        <w:t> dibujos sencillos sobre las categorías gente, comida, ropa, aseo, cuerpo, salud, ocio, limpieza, cocina, hogar, lugares, trabajo, escuela, animales, transporte…, en definitiva, conceptos comunes para la comunicación cotidiana. SPC propuso la organización organización del vocabulario por categorías semánticas al combinar tipos de palabras (sustantivos, verbos, adjetivos) con campos semánticos (lugares, días de la semana, colegio, muebles…).</w:t>
+        <w:t xml:space="preserve"> dibujos sencillos sobre las categorías gente, comida, ropa, aseo, cuerpo, salud, ocio, limpieza, cocina, hogar, lugares, trabajo, escuela, animales, transporte…, en definitiva, conceptos comunes para la comunicación cotidiana. SPC propuso la organización </w:t>
+      </w:r>
+      <w:proofErr w:type="spellStart"/>
+      <w:r>
+        <w:t>organización</w:t>
+      </w:r>
+      <w:proofErr w:type="spellEnd"/>
+      <w:r>
+        <w:t xml:space="preserve"> del vocabulario por categorías semánticas al combinar tipos de palabras (sustantivos, verbos, adjetivos) con campos semánticos (lugares, días de la semana, colegio, muebles…).</w:t>
       </w:r>
     </w:p>
     <w:p>
@@ -1328,8 +1432,13 @@
           <w:numId w:val="1"/>
         </w:numPr>
       </w:pPr>
-      <w:r>
-        <w:t xml:space="preserve">Widgit: </w:t>
+      <w:proofErr w:type="spellStart"/>
+      <w:r>
+        <w:t>Widgit</w:t>
+      </w:r>
+      <w:proofErr w:type="spellEnd"/>
+      <w:r>
+        <w:t xml:space="preserve">: </w:t>
       </w:r>
       <w:r>
         <w:t>al tiempo que se escribe un texto, se va asignando una imagen automáticamente a cada palabra. Hoy día hay otros traductores de texto a imagen, aunque la calidad depende del idioma y de la complejidad del mensaje</w:t>
@@ -1358,9 +1467,11 @@
           <w:numId w:val="1"/>
         </w:numPr>
       </w:pPr>
+      <w:proofErr w:type="spellStart"/>
       <w:r>
         <w:t>Symbolstix</w:t>
       </w:r>
+      <w:proofErr w:type="spellEnd"/>
       <w:r>
         <w:t xml:space="preserve">: </w:t>
       </w:r>
@@ -1541,9 +1652,11 @@
       </w:hyperlink>
     </w:p>
     <w:p>
+      <w:proofErr w:type="spellStart"/>
       <w:r>
         <w:t>Justificacion</w:t>
       </w:r>
+      <w:proofErr w:type="spellEnd"/>
     </w:p>
     <w:p>
       <w:hyperlink r:id="rId7" w:history="1">
@@ -1742,7 +1855,15 @@
     </w:p>
     <w:p>
       <w:r>
-        <w:t>Especificar que nos centramos en los asistidos o con ayuda ya que para hablar por gestos no hace falta q nadie te diga na XD</w:t>
+        <w:t xml:space="preserve">Especificar que nos centramos en los asistidos o con ayuda ya que para hablar por gestos no hace falta q nadie te diga </w:t>
+      </w:r>
+      <w:proofErr w:type="spellStart"/>
+      <w:r>
+        <w:t>na</w:t>
+      </w:r>
+      <w:proofErr w:type="spellEnd"/>
+      <w:r>
+        <w:t xml:space="preserve"> XD</w:t>
       </w:r>
     </w:p>
     <w:p/>
@@ -3481,6 +3602,7 @@
                 <w14:ligatures w14:val="none"/>
               </w:rPr>
             </w:pPr>
+            <w:proofErr w:type="spellStart"/>
             <w:r>
               <w:rPr>
                 <w:rFonts w:ascii="Times New Roman" w:eastAsia="Times New Roman" w:hAnsi="Times New Roman" w:cs="Times New Roman"/>
@@ -3493,6 +3615,7 @@
               <w:lastRenderedPageBreak/>
               <w:t>SpeakBook</w:t>
             </w:r>
+            <w:proofErr w:type="spellEnd"/>
           </w:p>
         </w:tc>
         <w:tc>
@@ -4546,6 +4669,7 @@
                 <w14:ligatures w14:val="none"/>
               </w:rPr>
             </w:pPr>
+            <w:proofErr w:type="spellStart"/>
             <w:r>
               <w:rPr>
                 <w:rFonts w:ascii="Times New Roman" w:eastAsia="Times New Roman" w:hAnsi="Times New Roman" w:cs="Times New Roman"/>
@@ -4557,6 +4681,7 @@
               </w:rPr>
               <w:t>MegaBEE</w:t>
             </w:r>
+            <w:proofErr w:type="spellEnd"/>
           </w:p>
         </w:tc>
         <w:tc>
@@ -5087,7 +5212,31 @@
                 <w:lang w:eastAsia="es-ES"/>
                 <w14:ligatures w14:val="none"/>
               </w:rPr>
-              <w:t>Look to Speak</w:t>
+              <w:t xml:space="preserve">Look </w:t>
+            </w:r>
+            <w:proofErr w:type="spellStart"/>
+            <w:r>
+              <w:rPr>
+                <w:rFonts w:ascii="Times New Roman" w:eastAsia="Times New Roman" w:hAnsi="Times New Roman" w:cs="Times New Roman"/>
+                <w:kern w:val="0"/>
+                <w:sz w:val="14"/>
+                <w:szCs w:val="14"/>
+                <w:lang w:eastAsia="es-ES"/>
+                <w14:ligatures w14:val="none"/>
+              </w:rPr>
+              <w:t>to</w:t>
+            </w:r>
+            <w:proofErr w:type="spellEnd"/>
+            <w:r>
+              <w:rPr>
+                <w:rFonts w:ascii="Times New Roman" w:eastAsia="Times New Roman" w:hAnsi="Times New Roman" w:cs="Times New Roman"/>
+                <w:kern w:val="0"/>
+                <w:sz w:val="14"/>
+                <w:szCs w:val="14"/>
+                <w:lang w:eastAsia="es-ES"/>
+                <w14:ligatures w14:val="none"/>
+              </w:rPr>
+              <w:t xml:space="preserve"> Speak</w:t>
             </w:r>
           </w:p>
         </w:tc>
@@ -5610,6 +5759,7 @@
                 <w14:ligatures w14:val="none"/>
               </w:rPr>
             </w:pPr>
+            <w:proofErr w:type="spellStart"/>
             <w:r>
               <w:rPr>
                 <w:rFonts w:ascii="Times New Roman" w:eastAsia="Times New Roman" w:hAnsi="Times New Roman" w:cs="Times New Roman"/>
@@ -5621,36 +5771,61 @@
               </w:rPr>
               <w:t>Tallk</w:t>
             </w:r>
-          </w:p>
-        </w:tc>
-        <w:tc>
-          <w:tcPr>
-            <w:tcW w:w="0" w:type="auto"/>
-            <w:vAlign w:val="center"/>
-            <w:hideMark/>
-          </w:tcPr>
-          <w:p>
-            <w:pPr>
-              <w:spacing w:after="0" w:line="240" w:lineRule="auto"/>
-              <w:rPr>
-                <w:rFonts w:ascii="Times New Roman" w:eastAsia="Times New Roman" w:hAnsi="Times New Roman" w:cs="Times New Roman"/>
-                <w:kern w:val="0"/>
-                <w:sz w:val="14"/>
-                <w:szCs w:val="14"/>
-                <w:lang w:eastAsia="es-ES"/>
-                <w14:ligatures w14:val="none"/>
-              </w:rPr>
-            </w:pPr>
-            <w:r>
-              <w:rPr>
-                <w:rFonts w:ascii="Times New Roman" w:eastAsia="Times New Roman" w:hAnsi="Times New Roman" w:cs="Times New Roman"/>
-                <w:kern w:val="0"/>
-                <w:sz w:val="14"/>
-                <w:szCs w:val="14"/>
-                <w:lang w:eastAsia="es-ES"/>
-                <w14:ligatures w14:val="none"/>
-              </w:rPr>
-              <w:t>App eye-tracking</w:t>
+            <w:proofErr w:type="spellEnd"/>
+          </w:p>
+        </w:tc>
+        <w:tc>
+          <w:tcPr>
+            <w:tcW w:w="0" w:type="auto"/>
+            <w:vAlign w:val="center"/>
+            <w:hideMark/>
+          </w:tcPr>
+          <w:p>
+            <w:pPr>
+              <w:spacing w:after="0" w:line="240" w:lineRule="auto"/>
+              <w:rPr>
+                <w:rFonts w:ascii="Times New Roman" w:eastAsia="Times New Roman" w:hAnsi="Times New Roman" w:cs="Times New Roman"/>
+                <w:kern w:val="0"/>
+                <w:sz w:val="14"/>
+                <w:szCs w:val="14"/>
+                <w:lang w:eastAsia="es-ES"/>
+                <w14:ligatures w14:val="none"/>
+              </w:rPr>
+            </w:pPr>
+            <w:r>
+              <w:rPr>
+                <w:rFonts w:ascii="Times New Roman" w:eastAsia="Times New Roman" w:hAnsi="Times New Roman" w:cs="Times New Roman"/>
+                <w:kern w:val="0"/>
+                <w:sz w:val="14"/>
+                <w:szCs w:val="14"/>
+                <w:lang w:eastAsia="es-ES"/>
+                <w14:ligatures w14:val="none"/>
+              </w:rPr>
+              <w:t xml:space="preserve">App </w:t>
+            </w:r>
+            <w:proofErr w:type="spellStart"/>
+            <w:r>
+              <w:rPr>
+                <w:rFonts w:ascii="Times New Roman" w:eastAsia="Times New Roman" w:hAnsi="Times New Roman" w:cs="Times New Roman"/>
+                <w:kern w:val="0"/>
+                <w:sz w:val="14"/>
+                <w:szCs w:val="14"/>
+                <w:lang w:eastAsia="es-ES"/>
+                <w14:ligatures w14:val="none"/>
+              </w:rPr>
+              <w:t>eye</w:t>
+            </w:r>
+            <w:proofErr w:type="spellEnd"/>
+            <w:r>
+              <w:rPr>
+                <w:rFonts w:ascii="Times New Roman" w:eastAsia="Times New Roman" w:hAnsi="Times New Roman" w:cs="Times New Roman"/>
+                <w:kern w:val="0"/>
+                <w:sz w:val="14"/>
+                <w:szCs w:val="14"/>
+                <w:lang w:eastAsia="es-ES"/>
+                <w14:ligatures w14:val="none"/>
+              </w:rPr>
+              <w:t>-tracking</w:t>
             </w:r>
           </w:p>
         </w:tc>
@@ -6142,16 +6317,29 @@
                 <w14:ligatures w14:val="none"/>
               </w:rPr>
             </w:pPr>
-            <w:r>
-              <w:rPr>
-                <w:rFonts w:ascii="Times New Roman" w:eastAsia="Times New Roman" w:hAnsi="Times New Roman" w:cs="Times New Roman"/>
-                <w:kern w:val="0"/>
-                <w:sz w:val="14"/>
-                <w:szCs w:val="14"/>
-                <w:lang w:eastAsia="es-ES"/>
-                <w14:ligatures w14:val="none"/>
-              </w:rPr>
-              <w:t>Grid 3</w:t>
+            <w:proofErr w:type="spellStart"/>
+            <w:r>
+              <w:rPr>
+                <w:rFonts w:ascii="Times New Roman" w:eastAsia="Times New Roman" w:hAnsi="Times New Roman" w:cs="Times New Roman"/>
+                <w:kern w:val="0"/>
+                <w:sz w:val="14"/>
+                <w:szCs w:val="14"/>
+                <w:lang w:eastAsia="es-ES"/>
+                <w14:ligatures w14:val="none"/>
+              </w:rPr>
+              <w:t>Grid</w:t>
+            </w:r>
+            <w:proofErr w:type="spellEnd"/>
+            <w:r>
+              <w:rPr>
+                <w:rFonts w:ascii="Times New Roman" w:eastAsia="Times New Roman" w:hAnsi="Times New Roman" w:cs="Times New Roman"/>
+                <w:kern w:val="0"/>
+                <w:sz w:val="14"/>
+                <w:szCs w:val="14"/>
+                <w:lang w:eastAsia="es-ES"/>
+                <w14:ligatures w14:val="none"/>
+              </w:rPr>
+              <w:t xml:space="preserve"> 3</w:t>
             </w:r>
           </w:p>
         </w:tc>
@@ -7215,7 +7403,31 @@
                 <w:lang w:eastAsia="es-ES"/>
                 <w14:ligatures w14:val="none"/>
               </w:rPr>
-              <w:t>Eye tracker HW</w:t>
+              <w:t xml:space="preserve">Eye </w:t>
+            </w:r>
+            <w:proofErr w:type="spellStart"/>
+            <w:r>
+              <w:rPr>
+                <w:rFonts w:ascii="Times New Roman" w:eastAsia="Times New Roman" w:hAnsi="Times New Roman" w:cs="Times New Roman"/>
+                <w:kern w:val="0"/>
+                <w:sz w:val="14"/>
+                <w:szCs w:val="14"/>
+                <w:lang w:eastAsia="es-ES"/>
+                <w14:ligatures w14:val="none"/>
+              </w:rPr>
+              <w:t>tracker</w:t>
+            </w:r>
+            <w:proofErr w:type="spellEnd"/>
+            <w:r>
+              <w:rPr>
+                <w:rFonts w:ascii="Times New Roman" w:eastAsia="Times New Roman" w:hAnsi="Times New Roman" w:cs="Times New Roman"/>
+                <w:kern w:val="0"/>
+                <w:sz w:val="14"/>
+                <w:szCs w:val="14"/>
+                <w:lang w:eastAsia="es-ES"/>
+                <w14:ligatures w14:val="none"/>
+              </w:rPr>
+              <w:t xml:space="preserve"> HW</w:t>
             </w:r>
           </w:p>
         </w:tc>
@@ -10015,8 +10227,13 @@
           </w:tcPr>
           <w:p>
             <w:r>
-              <w:t>P max</w:t>
-            </w:r>
+              <w:t xml:space="preserve">P </w:t>
+            </w:r>
+            <w:proofErr w:type="spellStart"/>
+            <w:r>
+              <w:t>max</w:t>
+            </w:r>
+            <w:proofErr w:type="spellEnd"/>
           </w:p>
         </w:tc>
         <w:tc>
@@ -10133,8 +10350,13 @@
           </w:tcPr>
           <w:p>
             <w:r>
-              <w:t>Speak book</w:t>
-            </w:r>
+              <w:t xml:space="preserve">Speak </w:t>
+            </w:r>
+            <w:proofErr w:type="spellStart"/>
+            <w:r>
+              <w:t>book</w:t>
+            </w:r>
+            <w:proofErr w:type="spellEnd"/>
           </w:p>
         </w:tc>
         <w:tc>
@@ -10186,8 +10408,13 @@
               <w:t>99</w:t>
             </w:r>
             <w:r>
-              <w:t>+ envio</w:t>
-            </w:r>
+              <w:t xml:space="preserve">+ </w:t>
+            </w:r>
+            <w:proofErr w:type="spellStart"/>
+            <w:r>
+              <w:t>envio</w:t>
+            </w:r>
+            <w:proofErr w:type="spellEnd"/>
           </w:p>
         </w:tc>
         <w:tc>
@@ -10325,8 +10552,21 @@
           </w:tcPr>
           <w:p>
             <w:r>
-              <w:t>Look to speak</w:t>
-            </w:r>
+              <w:t xml:space="preserve">Look </w:t>
+            </w:r>
+            <w:proofErr w:type="spellStart"/>
+            <w:r>
+              <w:t>to</w:t>
+            </w:r>
+            <w:proofErr w:type="spellEnd"/>
+            <w:r>
+              <w:t xml:space="preserve"> </w:t>
+            </w:r>
+            <w:proofErr w:type="spellStart"/>
+            <w:r>
+              <w:t>speak</w:t>
+            </w:r>
+            <w:proofErr w:type="spellEnd"/>
           </w:p>
         </w:tc>
         <w:tc>
@@ -10364,9 +10604,11 @@
             <w:tcW w:w="1698" w:type="dxa"/>
           </w:tcPr>
           <w:p>
+            <w:proofErr w:type="spellStart"/>
             <w:r>
               <w:t>Tallk</w:t>
             </w:r>
+            <w:proofErr w:type="spellEnd"/>
           </w:p>
         </w:tc>
         <w:tc>
@@ -10404,8 +10646,13 @@
             <w:tcW w:w="1698" w:type="dxa"/>
           </w:tcPr>
           <w:p>
-            <w:r>
-              <w:t>Grid 3</w:t>
+            <w:proofErr w:type="spellStart"/>
+            <w:r>
+              <w:t>Grid</w:t>
+            </w:r>
+            <w:proofErr w:type="spellEnd"/>
+            <w:r>
+              <w:t xml:space="preserve"> 3</w:t>
             </w:r>
           </w:p>
         </w:tc>
@@ -10739,8 +10986,21 @@
           </w:tcPr>
           <w:p>
             <w:r>
-              <w:t>Look to learn</w:t>
-            </w:r>
+              <w:t xml:space="preserve">Look </w:t>
+            </w:r>
+            <w:proofErr w:type="spellStart"/>
+            <w:r>
+              <w:t>to</w:t>
+            </w:r>
+            <w:proofErr w:type="spellEnd"/>
+            <w:r>
+              <w:t xml:space="preserve"> </w:t>
+            </w:r>
+            <w:proofErr w:type="spellStart"/>
+            <w:r>
+              <w:t>learn</w:t>
+            </w:r>
+            <w:proofErr w:type="spellEnd"/>
           </w:p>
         </w:tc>
         <w:tc>
@@ -11044,8 +11304,13 @@
           </w:tcPr>
           <w:p>
             <w:r>
-              <w:t>Gratis para ios</w:t>
-            </w:r>
+              <w:t xml:space="preserve">Gratis para </w:t>
+            </w:r>
+            <w:proofErr w:type="spellStart"/>
+            <w:r>
+              <w:t>ios</w:t>
+            </w:r>
+            <w:proofErr w:type="spellEnd"/>
           </w:p>
         </w:tc>
         <w:tc>
@@ -11054,8 +11319,13 @@
           </w:tcPr>
           <w:p>
             <w:r>
-              <w:t>Gratis para ios</w:t>
-            </w:r>
+              <w:t xml:space="preserve">Gratis para </w:t>
+            </w:r>
+            <w:proofErr w:type="spellStart"/>
+            <w:r>
+              <w:t>ios</w:t>
+            </w:r>
+            <w:proofErr w:type="spellEnd"/>
           </w:p>
         </w:tc>
         <w:tc>
@@ -11086,12 +11356,26 @@
               <w:rPr>
                 <w:lang w:val="en-GB"/>
               </w:rPr>
-              <w:t>Voice Acess/Speak to t</w:t>
-            </w:r>
+              <w:t xml:space="preserve">Voice </w:t>
+            </w:r>
+            <w:proofErr w:type="spellStart"/>
             <w:r>
               <w:rPr>
                 <w:lang w:val="en-GB"/>
               </w:rPr>
+              <w:t>Acess</w:t>
+            </w:r>
+            <w:proofErr w:type="spellEnd"/>
+            <w:r>
+              <w:rPr>
+                <w:lang w:val="en-GB"/>
+              </w:rPr>
+              <w:t>/Speak to t</w:t>
+            </w:r>
+            <w:r>
+              <w:rPr>
+                <w:lang w:val="en-GB"/>
+              </w:rPr>
               <w:t>ext</w:t>
             </w:r>
           </w:p>
@@ -11102,11 +11386,24 @@
           </w:tcPr>
           <w:p>
             <w:r>
-              <w:t>Gratis uno de android y</w:t>
-            </w:r>
-            <w:r>
-              <w:t xml:space="preserve"> otro de ios</w:t>
-            </w:r>
+              <w:t xml:space="preserve">Gratis uno de </w:t>
+            </w:r>
+            <w:proofErr w:type="spellStart"/>
+            <w:r>
+              <w:t>android</w:t>
+            </w:r>
+            <w:proofErr w:type="spellEnd"/>
+            <w:r>
+              <w:t xml:space="preserve"> y</w:t>
+            </w:r>
+            <w:r>
+              <w:t xml:space="preserve"> otro de </w:t>
+            </w:r>
+            <w:proofErr w:type="spellStart"/>
+            <w:r>
+              <w:t>ios</w:t>
+            </w:r>
+            <w:proofErr w:type="spellEnd"/>
           </w:p>
         </w:tc>
         <w:tc>
@@ -11141,11 +11438,11 @@
         <w:tblLook w:val="04A0" w:firstRow="1" w:lastRow="0" w:firstColumn="1" w:lastColumn="0" w:noHBand="0" w:noVBand="1"/>
       </w:tblPr>
       <w:tblGrid>
-        <w:gridCol w:w="1409"/>
-        <w:gridCol w:w="1041"/>
-        <w:gridCol w:w="739"/>
+        <w:gridCol w:w="1384"/>
+        <w:gridCol w:w="988"/>
+        <w:gridCol w:w="895"/>
         <w:gridCol w:w="4566"/>
-        <w:gridCol w:w="739"/>
+        <w:gridCol w:w="661"/>
       </w:tblGrid>
       <w:tr>
         <w:tc>
@@ -11153,9 +11450,11 @@
             <w:tcW w:w="1698" w:type="dxa"/>
           </w:tcPr>
           <w:p>
+            <w:proofErr w:type="spellStart"/>
             <w:r>
               <w:t>ComuniQa</w:t>
             </w:r>
+            <w:proofErr w:type="spellEnd"/>
           </w:p>
         </w:tc>
         <w:tc>
@@ -11204,25 +11503,51 @@
           <w:tcPr>
             <w:tcW w:w="1698" w:type="dxa"/>
           </w:tcPr>
-          <w:p/>
+          <w:p>
+            <w:proofErr w:type="spellStart"/>
+            <w:r>
+              <w:t>TouchChat</w:t>
+            </w:r>
+            <w:proofErr w:type="spellEnd"/>
+          </w:p>
         </w:tc>
         <w:tc>
           <w:tcPr>
             <w:tcW w:w="1699" w:type="dxa"/>
           </w:tcPr>
-          <w:p/>
+          <w:p>
+            <w:r>
+              <w:t>300</w:t>
+            </w:r>
+          </w:p>
         </w:tc>
         <w:tc>
           <w:tcPr>
             <w:tcW w:w="1699" w:type="dxa"/>
           </w:tcPr>
-          <w:p/>
+          <w:p>
+            <w:r>
+              <w:t>iOS</w:t>
+            </w:r>
+          </w:p>
         </w:tc>
         <w:tc>
           <w:tcPr>
             <w:tcW w:w="1699" w:type="dxa"/>
           </w:tcPr>
-          <w:p/>
+          <w:p>
+            <w:hyperlink r:id="rId19" w:history="1">
+              <w:r>
+                <w:rPr>
+                  <w:rStyle w:val="Hipervnculo"/>
+                </w:rPr>
+                <w:t>https://touchchatapp.com/</w:t>
+              </w:r>
+            </w:hyperlink>
+            <w:r>
+              <w:t xml:space="preserve"> </w:t>
+            </w:r>
+          </w:p>
         </w:tc>
         <w:tc>
           <w:tcPr>
@@ -11363,7 +11688,7 @@
     <w:p/>
     <w:p/>
     <w:p>
-      <w:hyperlink r:id="rId19" w:history="1">
+      <w:hyperlink r:id="rId20" w:history="1">
         <w:r>
           <w:rPr>
             <w:rStyle w:val="Hipervnculo"/>
@@ -11398,8 +11723,13 @@
           <w:numId w:val="12"/>
         </w:numPr>
       </w:pPr>
-      <w:r>
-        <w:t>Simbolos básicos como objetos, personas, acciones y cualidades</w:t>
+      <w:proofErr w:type="spellStart"/>
+      <w:r>
+        <w:t>Simbolos</w:t>
+      </w:r>
+      <w:proofErr w:type="spellEnd"/>
+      <w:r>
+        <w:t xml:space="preserve"> básicos como objetos, personas, acciones y cualidades</w:t>
       </w:r>
     </w:p>
     <w:p>
@@ -11410,9 +11740,22 @@
           <w:numId w:val="12"/>
         </w:numPr>
       </w:pPr>
+      <w:proofErr w:type="spellStart"/>
       <w:r>
         <w:lastRenderedPageBreak/>
-        <w:t>Simbolos modificadores para representar elementos gramaticales y estructurar oraciones. Simbolos para pronombres, proposiciones, conjugaciones verbales</w:t>
+        <w:t>Simbolos</w:t>
+      </w:r>
+      <w:proofErr w:type="spellEnd"/>
+      <w:r>
+        <w:t xml:space="preserve"> modificadores para representar elementos gramaticales y estructurar oraciones. </w:t>
+      </w:r>
+      <w:proofErr w:type="spellStart"/>
+      <w:r>
+        <w:t>Simbolos</w:t>
+      </w:r>
+      <w:proofErr w:type="spellEnd"/>
+      <w:r>
+        <w:t xml:space="preserve"> para pronombres, proposiciones, conjugaciones verbales</w:t>
       </w:r>
     </w:p>
     <w:p>
@@ -11423,8 +11766,21 @@
           <w:numId w:val="12"/>
         </w:numPr>
       </w:pPr>
-      <w:r>
-        <w:t>Simbolos abstractos para ideas mas complejas o no tangibles como amor, libertad, justicia o pensamiento</w:t>
+      <w:proofErr w:type="spellStart"/>
+      <w:r>
+        <w:t>Simbolos</w:t>
+      </w:r>
+      <w:proofErr w:type="spellEnd"/>
+      <w:r>
+        <w:t xml:space="preserve"> abstractos para ideas </w:t>
+      </w:r>
+      <w:proofErr w:type="spellStart"/>
+      <w:r>
+        <w:t>mas</w:t>
+      </w:r>
+      <w:proofErr w:type="spellEnd"/>
+      <w:r>
+        <w:t xml:space="preserve"> complejas o no tangibles como amor, libertad, justicia o pensamiento</w:t>
       </w:r>
     </w:p>
     <w:p>
@@ -11435,9 +11791,19 @@
           <w:numId w:val="12"/>
         </w:numPr>
       </w:pPr>
-      <w:r>
-        <w:t>Simbolos fonéticos: Representan sonidos del lenguaje oral para ayudar a pronunciacion</w:t>
-      </w:r>
+      <w:proofErr w:type="spellStart"/>
+      <w:r>
+        <w:t>Simbolos</w:t>
+      </w:r>
+      <w:proofErr w:type="spellEnd"/>
+      <w:r>
+        <w:t xml:space="preserve"> fonéticos: Representan sonidos del lenguaje oral para ayudar a </w:t>
+      </w:r>
+      <w:proofErr w:type="spellStart"/>
+      <w:r>
+        <w:t>pronunciacion</w:t>
+      </w:r>
+      <w:proofErr w:type="spellEnd"/>
     </w:p>
     <w:p>
       <w:pPr>
@@ -11447,8 +11813,13 @@
           <w:numId w:val="12"/>
         </w:numPr>
       </w:pPr>
-      <w:r>
-        <w:t>Simbolos de categorías: Agrupar conceptos relacionados en categorías temáticas como animales, transporte, alimentos, ropa. Facilita organización y acceso</w:t>
+      <w:proofErr w:type="spellStart"/>
+      <w:r>
+        <w:t>Simbolos</w:t>
+      </w:r>
+      <w:proofErr w:type="spellEnd"/>
+      <w:r>
+        <w:t xml:space="preserve"> de categorías: Agrupar conceptos relacionados en categorías temáticas como animales, transporte, alimentos, ropa. Facilita organización y acceso</w:t>
       </w:r>
     </w:p>
     <w:p>
@@ -11459,8 +11830,13 @@
           <w:numId w:val="12"/>
         </w:numPr>
       </w:pPr>
-      <w:r>
-        <w:t>Simbolos numéricos para cantidades o contar</w:t>
+      <w:proofErr w:type="spellStart"/>
+      <w:r>
+        <w:t>Simbolos</w:t>
+      </w:r>
+      <w:proofErr w:type="spellEnd"/>
+      <w:r>
+        <w:t xml:space="preserve"> numéricos para cantidades o contar</w:t>
       </w:r>
     </w:p>
     <w:p>
@@ -11471,8 +11847,13 @@
           <w:numId w:val="12"/>
         </w:numPr>
       </w:pPr>
-      <w:r>
-        <w:t>Simbolos direccionales para indicar direcciones</w:t>
+      <w:proofErr w:type="spellStart"/>
+      <w:r>
+        <w:t>Simbolos</w:t>
+      </w:r>
+      <w:proofErr w:type="spellEnd"/>
+      <w:r>
+        <w:t xml:space="preserve"> direccionales para indicar direcciones</w:t>
       </w:r>
     </w:p>
     <w:p>
@@ -11483,8 +11864,13 @@
           <w:numId w:val="12"/>
         </w:numPr>
       </w:pPr>
-      <w:r>
-        <w:t>Simbolos de tiempo como días de la semana, meses, estaciones, momentos del día</w:t>
+      <w:proofErr w:type="spellStart"/>
+      <w:r>
+        <w:t>Simbolos</w:t>
+      </w:r>
+      <w:proofErr w:type="spellEnd"/>
+      <w:r>
+        <w:t xml:space="preserve"> de tiempo como días de la semana, meses, estaciones, momentos del día</w:t>
       </w:r>
     </w:p>
     <w:p>
@@ -11503,8 +11889,21 @@
           <w:numId w:val="13"/>
         </w:numPr>
       </w:pPr>
-      <w:r>
-        <w:t>Simbolos especiales para agregar claridad o transmitir info adicional como</w:t>
+      <w:proofErr w:type="spellStart"/>
+      <w:r>
+        <w:t>Simbolos</w:t>
+      </w:r>
+      <w:proofErr w:type="spellEnd"/>
+      <w:r>
+        <w:t xml:space="preserve"> especiales para agregar claridad o transmitir </w:t>
+      </w:r>
+      <w:proofErr w:type="spellStart"/>
+      <w:r>
+        <w:t>info</w:t>
+      </w:r>
+      <w:proofErr w:type="spellEnd"/>
+      <w:r>
+        <w:t xml:space="preserve"> adicional como</w:t>
       </w:r>
     </w:p>
     <w:p>
@@ -11516,7 +11915,15 @@
         </w:numPr>
       </w:pPr>
       <w:r>
-        <w:t>Negación: Negacion o ausencia de un concept</w:t>
+        <w:t xml:space="preserve">Negación: </w:t>
+      </w:r>
+      <w:proofErr w:type="spellStart"/>
+      <w:r>
+        <w:t>Negacion</w:t>
+      </w:r>
+      <w:proofErr w:type="spellEnd"/>
+      <w:r>
+        <w:t xml:space="preserve"> o ausencia de un concept</w:t>
       </w:r>
     </w:p>
     <w:p>
@@ -11527,8 +11934,13 @@
           <w:numId w:val="13"/>
         </w:numPr>
       </w:pPr>
-      <w:r>
-        <w:t>Interrogacion: Preguntas o interrogantes</w:t>
+      <w:proofErr w:type="spellStart"/>
+      <w:r>
+        <w:t>Interrogacion</w:t>
+      </w:r>
+      <w:proofErr w:type="spellEnd"/>
+      <w:r>
+        <w:t>: Preguntas o interrogantes</w:t>
       </w:r>
     </w:p>
     <w:p>
@@ -11595,8 +12007,13 @@
           <w:numId w:val="13"/>
         </w:numPr>
       </w:pPr>
-      <w:r>
-        <w:t>Adaptacion a las necesidades individuales: capacidades cognitivas, motoras y comunicativas</w:t>
+      <w:proofErr w:type="spellStart"/>
+      <w:r>
+        <w:t>Adaptacion</w:t>
+      </w:r>
+      <w:proofErr w:type="spellEnd"/>
+      <w:r>
+        <w:t xml:space="preserve"> a las necesidades individuales: capacidades cognitivas, motoras y comunicativas</w:t>
       </w:r>
     </w:p>
     <w:p>
@@ -11620,7 +12037,15 @@
         </w:numPr>
       </w:pPr>
       <w:r>
-        <w:t>Aprendizaje y practica. Hay que estar dispuesto a dedicar tiempo y esfuerzo</w:t>
+        <w:t xml:space="preserve">Aprendizaje y </w:t>
+      </w:r>
+      <w:proofErr w:type="spellStart"/>
+      <w:r>
+        <w:t>practica</w:t>
+      </w:r>
+      <w:proofErr w:type="spellEnd"/>
+      <w:r>
+        <w:t>. Hay que estar dispuesto a dedicar tiempo y esfuerzo</w:t>
       </w:r>
     </w:p>
     <w:p>
@@ -11643,8 +12068,13 @@
           <w:numId w:val="13"/>
         </w:numPr>
       </w:pPr>
-      <w:r>
-        <w:t>Personalizacion y flexibilidad que se adapte a necesidades y preferencias individuales</w:t>
+      <w:proofErr w:type="spellStart"/>
+      <w:r>
+        <w:t>Personalizacion</w:t>
+      </w:r>
+      <w:proofErr w:type="spellEnd"/>
+      <w:r>
+        <w:t xml:space="preserve"> y flexibilidad que se adapte a necesidades y preferencias individuales</w:t>
       </w:r>
     </w:p>
     <w:p>
@@ -11684,11 +12114,51 @@
     </w:p>
     <w:p>
       <w:r>
-        <w:t xml:space="preserve">3000 iconos organizados en diferentes categorías a los que se les pueden agregar más personalizados. Cada categoría esta representada por un color distinto para facilitar la comprensión (amarillo personas, verde verbos, rosa social…). Estos pictogramas son visualmente comprensibles y accesibles para personas con dificultades en el habla, lectura y escritura. La diferencia con BLISS es la forma en la que se representan visualmente los conceptos. BLISS es abstarcto y SPC concreto. En BLISS los símbolos se </w:t>
+        <w:t xml:space="preserve">3000 iconos organizados en diferentes categorías a los que se les pueden agregar más personalizados. Cada categoría </w:t>
+      </w:r>
+      <w:proofErr w:type="spellStart"/>
+      <w:r>
+        <w:t>esta</w:t>
+      </w:r>
+      <w:proofErr w:type="spellEnd"/>
+      <w:r>
+        <w:t xml:space="preserve"> representada por un color distinto para facilitar la comprensión (amarillo personas, verde verbos, rosa social…). Estos pictogramas son visualmente comprensibles y accesibles para personas con dificultades en el habla, lectura y escritura. La diferencia con BLISS es la forma en la que se representan visualmente los conceptos. BLISS es </w:t>
+      </w:r>
+      <w:proofErr w:type="spellStart"/>
+      <w:r>
+        <w:t>abstarcto</w:t>
+      </w:r>
+      <w:proofErr w:type="spellEnd"/>
+      <w:r>
+        <w:t xml:space="preserve"> y SPC concreto. En BLISS los símbolos se </w:t>
       </w:r>
       <w:r>
         <w:lastRenderedPageBreak/>
-        <w:t>combinan y modifican para formar mensajes completos, en SPC se selecciona directamente el pictograma. Puede parecer que SPC en general es mas claro por los pictogramas mas intuitivos, pero puede que se quede algo corto al ser pictogramas directos y no combinación? El SPC es mas adecuado para personas con nivel expresivo simple centrado en sujeto-verbo-complemento</w:t>
+        <w:t xml:space="preserve">combinan y modifican para formar mensajes completos, en SPC se selecciona directamente el pictograma. Puede parecer que SPC en general es </w:t>
+      </w:r>
+      <w:proofErr w:type="spellStart"/>
+      <w:r>
+        <w:t>mas</w:t>
+      </w:r>
+      <w:proofErr w:type="spellEnd"/>
+      <w:r>
+        <w:t xml:space="preserve"> claro por los pictogramas </w:t>
+      </w:r>
+      <w:proofErr w:type="spellStart"/>
+      <w:r>
+        <w:t>mas</w:t>
+      </w:r>
+      <w:proofErr w:type="spellEnd"/>
+      <w:r>
+        <w:t xml:space="preserve"> intuitivos, pero puede que se quede algo corto al ser pictogramas directos y no combinación? El SPC es </w:t>
+      </w:r>
+      <w:proofErr w:type="spellStart"/>
+      <w:r>
+        <w:t>mas</w:t>
+      </w:r>
+      <w:proofErr w:type="spellEnd"/>
+      <w:r>
+        <w:t xml:space="preserve"> adecuado para personas con nivel expresivo simple centrado en sujeto-verbo-complemento</w:t>
       </w:r>
     </w:p>
     <w:p>
@@ -11708,7 +12178,15 @@
     </w:p>
     <w:p>
       <w:r>
-        <w:t>Requiere tiempo y dedicación para aprender y además podría haber problema de rápida degeneracion de la motilidad fina que provoque tener que cambiar rápido a otro método. Quizá no haya tiempo que dedicarle a aprender el idioma</w:t>
+        <w:t xml:space="preserve">Requiere tiempo y dedicación para aprender y además podría haber problema de rápida </w:t>
+      </w:r>
+      <w:proofErr w:type="spellStart"/>
+      <w:r>
+        <w:t>degeneracion</w:t>
+      </w:r>
+      <w:proofErr w:type="spellEnd"/>
+      <w:r>
+        <w:t xml:space="preserve"> de la motilidad fina que provoque tener que cambiar rápido a otro método. Quizá no haya tiempo que dedicarle a aprender el idioma</w:t>
       </w:r>
     </w:p>
     <w:p>
@@ -11728,7 +12206,15 @@
     </w:p>
     <w:p>
       <w:r>
-        <w:t>Comunicación con personas que representan combinación de perdida auditiva y visual. Se representan las letras del alfabeto por el tacto en las manos del paciente. Cada letra tiene una ubicación especifica en la mano o dedos del comunicador de forma que la persona sordociega pueda sentir los movimientos o toques en diferentes partes de su mano para interpretar las letras correspondientes. Útil para personas con ELA y bajo nivel visual y auditivo</w:t>
+        <w:t xml:space="preserve">Comunicación con personas que representan combinación de </w:t>
+      </w:r>
+      <w:proofErr w:type="spellStart"/>
+      <w:r>
+        <w:t>perdida</w:t>
+      </w:r>
+      <w:proofErr w:type="spellEnd"/>
+      <w:r>
+        <w:t xml:space="preserve"> auditiva y visual. Se representan las letras del alfabeto por el tacto en las manos del paciente. Cada letra tiene una ubicación especifica en la mano o dedos del comunicador de forma que la persona sordociega pueda sentir los movimientos o toques en diferentes partes de su mano para interpretar las letras correspondientes. Útil para personas con ELA y bajo nivel visual y auditivo</w:t>
       </w:r>
     </w:p>
     <w:p>
@@ -11747,8 +12233,13 @@
       </w:r>
     </w:p>
     <w:p>
-      <w:r>
-        <w:t>Combinacion de lenguaje hablado y lengua de señas o gestos. Para personas con dificultades con el lenguaje oral</w:t>
+      <w:proofErr w:type="spellStart"/>
+      <w:r>
+        <w:t>Combinacion</w:t>
+      </w:r>
+      <w:proofErr w:type="spellEnd"/>
+      <w:r>
+        <w:t xml:space="preserve"> de lenguaje hablado y lengua de señas o gestos. Para personas con dificultades con el lenguaje oral</w:t>
       </w:r>
     </w:p>
     <w:p>
@@ -11775,6 +12266,40 @@
       <w:r>
         <w:t>Lectura labial + uso de posiciones de las manos cerca de la cara</w:t>
       </w:r>
+    </w:p>
+    <w:p/>
+    <w:p>
+      <w:r>
+        <w:t>Las categorías son aplicaciones de comunicación aumentativa y alternativa, programas de síntesis de voz, programas de reconocimiento de voz, software de traducción de texto a voz y viceversa y comunicadores electrónicos</w:t>
+      </w:r>
+    </w:p>
+    <w:p>
+      <w:pPr>
+        <w:pStyle w:val="Prrafodelista"/>
+        <w:numPr>
+          <w:ilvl w:val="0"/>
+          <w:numId w:val="1"/>
+        </w:numPr>
+      </w:pPr>
+      <w:r>
+        <w:t xml:space="preserve">App de CAA: Proloquo2Go, </w:t>
+      </w:r>
+      <w:proofErr w:type="spellStart"/>
+      <w:r>
+        <w:t>Grid</w:t>
+      </w:r>
+      <w:proofErr w:type="spellEnd"/>
+      <w:r>
+        <w:t xml:space="preserve"> por iPad, </w:t>
+      </w:r>
+      <w:proofErr w:type="spellStart"/>
+      <w:r>
+        <w:rPr>
+          <w:highlight w:val="yellow"/>
+        </w:rPr>
+        <w:t>TouchChat</w:t>
+      </w:r>
+      <w:proofErr w:type="spellEnd"/>
     </w:p>
     <w:sectPr>
       <w:pgSz w:w="11906" w:h="16838"/>
@@ -14485,6 +15010,18 @@
       </w:tblBorders>
     </w:tblPr>
   </w:style>
+  <w:style w:type="character" w:styleId="Hipervnculovisitado">
+    <w:name w:val="FollowedHyperlink"/>
+    <w:basedOn w:val="Fuentedeprrafopredeter"/>
+    <w:uiPriority w:val="99"/>
+    <w:semiHidden/>
+    <w:unhideWhenUsed/>
+    <w:rsid w:val="00E34AB0"/>
+    <w:rPr>
+      <w:color w:val="96607D" w:themeColor="followedHyperlink"/>
+      <w:u w:val="single"/>
+    </w:rPr>
+  </w:style>
 </w:styles>
 </file>
 

</xml_diff>

<commit_message>
Adición de clasificación tecnológica
</commit_message>
<xml_diff>
--- a/Base de datos/Información ELA.docx
+++ b/Base de datos/Información ELA.docx
@@ -108,7 +108,15 @@
     <w:p/>
     <w:p>
       <w:r>
-        <w:t xml:space="preserve">Incluir disponibilidad, hay algunas apps q solo están en </w:t>
+        <w:t xml:space="preserve">Incluir disponibilidad, hay algunas </w:t>
+      </w:r>
+      <w:proofErr w:type="gramStart"/>
+      <w:r>
+        <w:t>apps</w:t>
+      </w:r>
+      <w:proofErr w:type="gramEnd"/>
+      <w:r>
+        <w:t xml:space="preserve"> q solo están en </w:t>
       </w:r>
       <w:proofErr w:type="spellStart"/>
       <w:r>
@@ -150,9 +158,11 @@
     </w:p>
     <w:p/>
     <w:p>
+      <w:proofErr w:type="gramStart"/>
       <w:r>
         <w:t>Q movimientos voluntarios puede hacer de forma fiable?</w:t>
       </w:r>
+      <w:proofErr w:type="gramEnd"/>
       <w:r>
         <w:t xml:space="preserve"> Manos/cabeza/ojos/voz/pulsador/ninguno</w:t>
       </w:r>
@@ -207,8 +217,13 @@
     </w:p>
     <w:p/>
     <w:p>
-      <w:r>
-        <w:t>Cuanto tiempo puede mantener una acción repetitiva? &lt;30s, 1-5 min, &gt;5min</w:t>
+      <w:proofErr w:type="gramStart"/>
+      <w:r>
+        <w:t>Cuanto tiempo puede mantener una acción repetitiva?</w:t>
+      </w:r>
+      <w:proofErr w:type="gramEnd"/>
+      <w:r>
+        <w:t xml:space="preserve"> &lt;30s, 1-5 min, &gt;5min</w:t>
       </w:r>
     </w:p>
     <w:p>
@@ -228,8 +243,13 @@
       </w:r>
     </w:p>
     <w:p>
-      <w:r>
-        <w:t>Puede fijar la mirada y distinguir símbolos en pantalla? Normal/dificultad leve/dificultad alta</w:t>
+      <w:proofErr w:type="gramStart"/>
+      <w:r>
+        <w:t>Puede fijar la mirada y distinguir símbolos en pantalla?</w:t>
+      </w:r>
+      <w:proofErr w:type="gramEnd"/>
+      <w:r>
+        <w:t xml:space="preserve"> Normal/dificultad leve/dificultad alta</w:t>
       </w:r>
     </w:p>
     <w:p>
@@ -244,8 +264,13 @@
     </w:p>
     <w:p/>
     <w:p>
-      <w:r>
-        <w:t>Escucha con claridad voces sintetizadas? Si/No</w:t>
+      <w:proofErr w:type="gramStart"/>
+      <w:r>
+        <w:t>Escucha con claridad voces sintetizadas?</w:t>
+      </w:r>
+      <w:proofErr w:type="gramEnd"/>
+      <w:r>
+        <w:t xml:space="preserve"> Si/No</w:t>
       </w:r>
     </w:p>
     <w:p>
@@ -260,8 +285,21 @@
     </w:p>
     <w:p/>
     <w:p>
-      <w:r>
-        <w:t>Puede elegir entre opciones? Puede comprender pictogramas? Puede escribir palabras</w:t>
+      <w:proofErr w:type="gramStart"/>
+      <w:r>
+        <w:t>Puede elegir entre opciones?</w:t>
+      </w:r>
+      <w:proofErr w:type="gramEnd"/>
+      <w:r>
+        <w:t xml:space="preserve"> </w:t>
+      </w:r>
+      <w:proofErr w:type="gramStart"/>
+      <w:r>
+        <w:t>Puede comprender pictogramas?</w:t>
+      </w:r>
+      <w:proofErr w:type="gramEnd"/>
+      <w:r>
+        <w:t xml:space="preserve"> Puede escribir palabras</w:t>
       </w:r>
     </w:p>
     <w:p>
@@ -296,8 +334,13 @@
     </w:p>
     <w:p/>
     <w:p>
-      <w:r>
-        <w:t xml:space="preserve">Debe poder comunicarse sin ayuda? </w:t>
+      <w:proofErr w:type="gramStart"/>
+      <w:r>
+        <w:t>Debe poder comunicarse sin ayuda?</w:t>
+      </w:r>
+      <w:proofErr w:type="gramEnd"/>
+      <w:r>
+        <w:t xml:space="preserve"> </w:t>
       </w:r>
     </w:p>
     <w:p>
@@ -312,9 +355,11 @@
     </w:p>
     <w:p/>
     <w:p>
+      <w:proofErr w:type="gramStart"/>
       <w:r>
         <w:t>Donde lo usara principalmente?</w:t>
       </w:r>
+      <w:proofErr w:type="gramEnd"/>
     </w:p>
     <w:p>
       <w:r>
@@ -333,9 +378,11 @@
     </w:p>
     <w:p/>
     <w:p>
+      <w:proofErr w:type="gramStart"/>
       <w:r>
         <w:t>En que idioma necesita comunicarse?</w:t>
       </w:r>
+      <w:proofErr w:type="gramEnd"/>
     </w:p>
     <w:p>
       <w:r>
@@ -344,10 +391,12 @@
     </w:p>
     <w:p/>
     <w:p>
+      <w:proofErr w:type="gramStart"/>
       <w:r>
         <w:lastRenderedPageBreak/>
         <w:t>Cuanto tiempo puede dedicar a familiarizarse con el programa?</w:t>
       </w:r>
+      <w:proofErr w:type="gramEnd"/>
     </w:p>
     <w:p>
       <w:r>
@@ -366,14 +415,48 @@
     </w:p>
     <w:p/>
     <w:p>
-      <w:r>
-        <w:t>Prefiere tecnología o papel? Le molesta llevar dispositivos? Quiere voz sintética o no? Esto no filtra sino que pondera</w:t>
+      <w:proofErr w:type="gramStart"/>
+      <w:r>
+        <w:t>Prefiere tecnología o papel?</w:t>
+      </w:r>
+      <w:proofErr w:type="gramEnd"/>
+      <w:r>
+        <w:t xml:space="preserve"> </w:t>
+      </w:r>
+      <w:proofErr w:type="gramStart"/>
+      <w:r>
+        <w:t>Le molesta llevar dispositivos?</w:t>
+      </w:r>
+      <w:proofErr w:type="gramEnd"/>
+      <w:r>
+        <w:t xml:space="preserve"> </w:t>
+      </w:r>
+      <w:proofErr w:type="gramStart"/>
+      <w:r>
+        <w:t>Quiere voz sintética o no?</w:t>
+      </w:r>
+      <w:proofErr w:type="gramEnd"/>
+      <w:r>
+        <w:t xml:space="preserve"> Esto no </w:t>
+      </w:r>
+      <w:proofErr w:type="gramStart"/>
+      <w:r>
+        <w:t>filtra</w:t>
+      </w:r>
+      <w:proofErr w:type="gramEnd"/>
+      <w:r>
+        <w:t xml:space="preserve"> sino que pondera</w:t>
       </w:r>
     </w:p>
     <w:p/>
     <w:p>
-      <w:r>
-        <w:t>manual Test COMFOR</w:t>
+      <w:proofErr w:type="gramStart"/>
+      <w:r>
+        <w:t>manual Test</w:t>
+      </w:r>
+      <w:proofErr w:type="gramEnd"/>
+      <w:r>
+        <w:t xml:space="preserve"> COMFOR</w:t>
       </w:r>
       <w:r>
         <w:t xml:space="preserve">. </w:t>
@@ -1373,8 +1456,13 @@
         <w:t xml:space="preserve"> </w:t>
       </w:r>
       <w:r>
-        <w:t>en el que los pictogramas simbolizan funciones del lenguaje (“tengo que contarte algo”; “quiero hablar de otro tema”; “pasa la página”…</w:t>
-      </w:r>
+        <w:t xml:space="preserve">en el que los pictogramas simbolizan funciones del lenguaje (“tengo que contarte algo”; “quiero hablar de otro tema”; “pasa la </w:t>
+      </w:r>
+      <w:proofErr w:type="gramStart"/>
+      <w:r>
+        <w:t>página”…</w:t>
+      </w:r>
+      <w:proofErr w:type="gramEnd"/>
     </w:p>
     <w:p>
       <w:pPr>
@@ -1854,8 +1942,13 @@
       </w:r>
     </w:p>
     <w:p>
-      <w:r>
-        <w:t xml:space="preserve">Especificar que nos centramos en los asistidos o con ayuda ya que para hablar por gestos no hace falta q nadie te diga </w:t>
+      <w:proofErr w:type="gramStart"/>
+      <w:r>
+        <w:t>Especificar</w:t>
+      </w:r>
+      <w:proofErr w:type="gramEnd"/>
+      <w:r>
+        <w:t xml:space="preserve"> que nos centramos en los asistidos o con ayuda ya que para hablar por gestos no hace falta q nadie te diga </w:t>
       </w:r>
       <w:proofErr w:type="spellStart"/>
       <w:r>
@@ -5203,16 +5296,29 @@
                 <w14:ligatures w14:val="none"/>
               </w:rPr>
             </w:pPr>
-            <w:r>
-              <w:rPr>
-                <w:rFonts w:ascii="Times New Roman" w:eastAsia="Times New Roman" w:hAnsi="Times New Roman" w:cs="Times New Roman"/>
-                <w:kern w:val="0"/>
-                <w:sz w:val="14"/>
-                <w:szCs w:val="14"/>
-                <w:lang w:eastAsia="es-ES"/>
-                <w14:ligatures w14:val="none"/>
-              </w:rPr>
-              <w:t xml:space="preserve">Look </w:t>
+            <w:proofErr w:type="gramStart"/>
+            <w:r>
+              <w:rPr>
+                <w:rFonts w:ascii="Times New Roman" w:eastAsia="Times New Roman" w:hAnsi="Times New Roman" w:cs="Times New Roman"/>
+                <w:kern w:val="0"/>
+                <w:sz w:val="14"/>
+                <w:szCs w:val="14"/>
+                <w:lang w:eastAsia="es-ES"/>
+                <w14:ligatures w14:val="none"/>
+              </w:rPr>
+              <w:t>Look</w:t>
+            </w:r>
+            <w:proofErr w:type="gramEnd"/>
+            <w:r>
+              <w:rPr>
+                <w:rFonts w:ascii="Times New Roman" w:eastAsia="Times New Roman" w:hAnsi="Times New Roman" w:cs="Times New Roman"/>
+                <w:kern w:val="0"/>
+                <w:sz w:val="14"/>
+                <w:szCs w:val="14"/>
+                <w:lang w:eastAsia="es-ES"/>
+                <w14:ligatures w14:val="none"/>
+              </w:rPr>
+              <w:t xml:space="preserve"> </w:t>
             </w:r>
             <w:proofErr w:type="spellStart"/>
             <w:r>
@@ -6902,8 +7008,21 @@
                 <w:lang w:eastAsia="es-ES"/>
                 <w14:ligatures w14:val="none"/>
               </w:rPr>
-              <w:t>Comunicador app</w:t>
-            </w:r>
+              <w:t xml:space="preserve">Comunicador </w:t>
+            </w:r>
+            <w:proofErr w:type="gramStart"/>
+            <w:r>
+              <w:rPr>
+                <w:rFonts w:ascii="Times New Roman" w:eastAsia="Times New Roman" w:hAnsi="Times New Roman" w:cs="Times New Roman"/>
+                <w:kern w:val="0"/>
+                <w:sz w:val="14"/>
+                <w:szCs w:val="14"/>
+                <w:lang w:eastAsia="es-ES"/>
+                <w14:ligatures w14:val="none"/>
+              </w:rPr>
+              <w:t>app</w:t>
+            </w:r>
+            <w:proofErr w:type="gramEnd"/>
           </w:p>
         </w:tc>
         <w:tc>
@@ -10241,9 +10360,11 @@
             <w:tcW w:w="1699" w:type="dxa"/>
           </w:tcPr>
           <w:p>
+            <w:proofErr w:type="gramStart"/>
             <w:r>
               <w:t>Link</w:t>
             </w:r>
+            <w:proofErr w:type="gramEnd"/>
           </w:p>
         </w:tc>
         <w:tc>
@@ -10551,8 +10672,13 @@
             <w:tcW w:w="1698" w:type="dxa"/>
           </w:tcPr>
           <w:p>
-            <w:r>
-              <w:t xml:space="preserve">Look </w:t>
+            <w:proofErr w:type="gramStart"/>
+            <w:r>
+              <w:t>Look</w:t>
+            </w:r>
+            <w:proofErr w:type="gramEnd"/>
+            <w:r>
+              <w:t xml:space="preserve"> </w:t>
             </w:r>
             <w:proofErr w:type="spellStart"/>
             <w:r>
@@ -10575,8 +10701,13 @@
           </w:tcPr>
           <w:p>
             <w:r>
-              <w:t>Gratis app</w:t>
-            </w:r>
+              <w:t xml:space="preserve">Gratis </w:t>
+            </w:r>
+            <w:proofErr w:type="gramStart"/>
+            <w:r>
+              <w:t>app</w:t>
+            </w:r>
+            <w:proofErr w:type="gramEnd"/>
           </w:p>
         </w:tc>
         <w:tc>
@@ -10617,8 +10748,13 @@
           </w:tcPr>
           <w:p>
             <w:r>
-              <w:t>Gratis app</w:t>
-            </w:r>
+              <w:t xml:space="preserve">Gratis </w:t>
+            </w:r>
+            <w:proofErr w:type="gramStart"/>
+            <w:r>
+              <w:t>app</w:t>
+            </w:r>
+            <w:proofErr w:type="gramEnd"/>
           </w:p>
         </w:tc>
         <w:tc>
@@ -10985,8 +11121,13 @@
             <w:tcW w:w="1698" w:type="dxa"/>
           </w:tcPr>
           <w:p>
-            <w:r>
-              <w:t xml:space="preserve">Look </w:t>
+            <w:proofErr w:type="gramStart"/>
+            <w:r>
+              <w:t>Look</w:t>
+            </w:r>
+            <w:proofErr w:type="gramEnd"/>
+            <w:r>
+              <w:t xml:space="preserve"> </w:t>
             </w:r>
             <w:proofErr w:type="spellStart"/>
             <w:r>
@@ -11963,8 +12104,13 @@
           <w:numId w:val="13"/>
         </w:numPr>
       </w:pPr>
-      <w:r>
-        <w:t>Tiempo(?</w:t>
+      <w:proofErr w:type="gramStart"/>
+      <w:r>
+        <w:t>Tiempo(</w:t>
+      </w:r>
+      <w:proofErr w:type="gramEnd"/>
+      <w:r>
+        <w:t>?</w:t>
       </w:r>
     </w:p>
     <w:p>
@@ -12094,7 +12240,15 @@
     </w:p>
     <w:p>
       <w:r>
-        <w:t>Sistema de comunicación por intercambio de imágenes. Parece que no se aplica tanto en ELA como en niños con autismo, puede que sea algo infantilizado pero se podría valorar con personas con bajo nivel cognitivo?</w:t>
+        <w:t xml:space="preserve">Sistema de comunicación por intercambio de imágenes. Parece que no se aplica tanto en ELA como en niños con autismo, puede que sea algo </w:t>
+      </w:r>
+      <w:proofErr w:type="gramStart"/>
+      <w:r>
+        <w:t>infantilizado</w:t>
+      </w:r>
+      <w:proofErr w:type="gramEnd"/>
+      <w:r>
+        <w:t xml:space="preserve"> pero se podría valorar con personas con bajo nivel cognitivo?</w:t>
       </w:r>
     </w:p>
     <w:p>
@@ -12134,7 +12288,11 @@
       </w:r>
       <w:r>
         <w:lastRenderedPageBreak/>
-        <w:t xml:space="preserve">combinan y modifican para formar mensajes completos, en SPC se selecciona directamente el pictograma. Puede parecer que SPC en general es </w:t>
+        <w:t xml:space="preserve">combinan y modifican para formar mensajes completos, en SPC se selecciona directamente el pictograma. </w:t>
+      </w:r>
+      <w:proofErr w:type="gramStart"/>
+      <w:r>
+        <w:t xml:space="preserve">Puede parecer que SPC en general es </w:t>
       </w:r>
       <w:proofErr w:type="spellStart"/>
       <w:r>
@@ -12150,7 +12308,11 @@
       </w:r>
       <w:proofErr w:type="spellEnd"/>
       <w:r>
-        <w:t xml:space="preserve"> intuitivos, pero puede que se quede algo corto al ser pictogramas directos y no combinación? El SPC es </w:t>
+        <w:t xml:space="preserve"> intuitivos, pero puede que se quede algo corto al ser pictogramas directos y no combinación?</w:t>
+      </w:r>
+      <w:proofErr w:type="gramEnd"/>
+      <w:r>
+        <w:t xml:space="preserve"> El SPC es </w:t>
       </w:r>
       <w:proofErr w:type="spellStart"/>
       <w:r>
@@ -12426,6 +12588,19 @@
       <w:proofErr w:type="spellEnd"/>
       <w:r>
         <w:t xml:space="preserve"> los estilos</w:t>
+      </w:r>
+    </w:p>
+    <w:p>
+      <w:hyperlink r:id="rId25" w:history="1">
+        <w:r>
+          <w:rPr>
+            <w:rStyle w:val="Hipervnculo"/>
+          </w:rPr>
+          <w:t>https://www.plenainclusion.org/discapacidad-intelectual/recurso/sistemas-alternativos-y-aumentativos-de-comunicacion/</w:t>
+        </w:r>
+      </w:hyperlink>
+      <w:r>
+        <w:t xml:space="preserve"> </w:t>
       </w:r>
     </w:p>
     <w:sectPr>

</xml_diff>

<commit_message>
Descripción de metodología en memoria
</commit_message>
<xml_diff>
--- a/Base de datos/Información ELA.docx
+++ b/Base de datos/Información ELA.docx
@@ -108,15 +108,7 @@
     <w:p/>
     <w:p>
       <w:r>
-        <w:t xml:space="preserve">Incluir disponibilidad, hay algunas </w:t>
-      </w:r>
-      <w:proofErr w:type="gramStart"/>
-      <w:r>
-        <w:t>apps</w:t>
-      </w:r>
-      <w:proofErr w:type="gramEnd"/>
-      <w:r>
-        <w:t xml:space="preserve"> q solo están en </w:t>
+        <w:t xml:space="preserve">Incluir disponibilidad, hay algunas apps q solo están en </w:t>
       </w:r>
       <w:proofErr w:type="spellStart"/>
       <w:r>
@@ -158,11 +150,9 @@
     </w:p>
     <w:p/>
     <w:p>
-      <w:proofErr w:type="gramStart"/>
       <w:r>
         <w:t>Q movimientos voluntarios puede hacer de forma fiable?</w:t>
       </w:r>
-      <w:proofErr w:type="gramEnd"/>
       <w:r>
         <w:t xml:space="preserve"> Manos/cabeza/ojos/voz/pulsador/ninguno</w:t>
       </w:r>
@@ -217,13 +207,8 @@
     </w:p>
     <w:p/>
     <w:p>
-      <w:proofErr w:type="gramStart"/>
-      <w:r>
-        <w:t>Cuanto tiempo puede mantener una acción repetitiva?</w:t>
-      </w:r>
-      <w:proofErr w:type="gramEnd"/>
-      <w:r>
-        <w:t xml:space="preserve"> &lt;30s, 1-5 min, &gt;5min</w:t>
+      <w:r>
+        <w:t>Cuanto tiempo puede mantener una acción repetitiva? &lt;30s, 1-5 min, &gt;5min</w:t>
       </w:r>
     </w:p>
     <w:p>
@@ -243,13 +228,8 @@
       </w:r>
     </w:p>
     <w:p>
-      <w:proofErr w:type="gramStart"/>
-      <w:r>
-        <w:t>Puede fijar la mirada y distinguir símbolos en pantalla?</w:t>
-      </w:r>
-      <w:proofErr w:type="gramEnd"/>
-      <w:r>
-        <w:t xml:space="preserve"> Normal/dificultad leve/dificultad alta</w:t>
+      <w:r>
+        <w:t>Puede fijar la mirada y distinguir símbolos en pantalla? Normal/dificultad leve/dificultad alta</w:t>
       </w:r>
     </w:p>
     <w:p>
@@ -264,13 +244,8 @@
     </w:p>
     <w:p/>
     <w:p>
-      <w:proofErr w:type="gramStart"/>
-      <w:r>
-        <w:t>Escucha con claridad voces sintetizadas?</w:t>
-      </w:r>
-      <w:proofErr w:type="gramEnd"/>
-      <w:r>
-        <w:t xml:space="preserve"> Si/No</w:t>
+      <w:r>
+        <w:t>Escucha con claridad voces sintetizadas? Si/No</w:t>
       </w:r>
     </w:p>
     <w:p>
@@ -285,21 +260,8 @@
     </w:p>
     <w:p/>
     <w:p>
-      <w:proofErr w:type="gramStart"/>
-      <w:r>
-        <w:t>Puede elegir entre opciones?</w:t>
-      </w:r>
-      <w:proofErr w:type="gramEnd"/>
-      <w:r>
-        <w:t xml:space="preserve"> </w:t>
-      </w:r>
-      <w:proofErr w:type="gramStart"/>
-      <w:r>
-        <w:t>Puede comprender pictogramas?</w:t>
-      </w:r>
-      <w:proofErr w:type="gramEnd"/>
-      <w:r>
-        <w:t xml:space="preserve"> Puede escribir palabras</w:t>
+      <w:r>
+        <w:t>Puede elegir entre opciones? Puede comprender pictogramas? Puede escribir palabras</w:t>
       </w:r>
     </w:p>
     <w:p>
@@ -334,13 +296,8 @@
     </w:p>
     <w:p/>
     <w:p>
-      <w:proofErr w:type="gramStart"/>
-      <w:r>
-        <w:t>Debe poder comunicarse sin ayuda?</w:t>
-      </w:r>
-      <w:proofErr w:type="gramEnd"/>
-      <w:r>
-        <w:t xml:space="preserve"> </w:t>
+      <w:r>
+        <w:t xml:space="preserve">Debe poder comunicarse sin ayuda? </w:t>
       </w:r>
     </w:p>
     <w:p>
@@ -355,11 +312,9 @@
     </w:p>
     <w:p/>
     <w:p>
-      <w:proofErr w:type="gramStart"/>
       <w:r>
         <w:t>Donde lo usara principalmente?</w:t>
       </w:r>
-      <w:proofErr w:type="gramEnd"/>
     </w:p>
     <w:p>
       <w:r>
@@ -378,11 +333,9 @@
     </w:p>
     <w:p/>
     <w:p>
-      <w:proofErr w:type="gramStart"/>
       <w:r>
         <w:t>En que idioma necesita comunicarse?</w:t>
       </w:r>
-      <w:proofErr w:type="gramEnd"/>
     </w:p>
     <w:p>
       <w:r>
@@ -391,12 +344,10 @@
     </w:p>
     <w:p/>
     <w:p>
-      <w:proofErr w:type="gramStart"/>
       <w:r>
         <w:lastRenderedPageBreak/>
         <w:t>Cuanto tiempo puede dedicar a familiarizarse con el programa?</w:t>
       </w:r>
-      <w:proofErr w:type="gramEnd"/>
     </w:p>
     <w:p>
       <w:r>
@@ -415,48 +366,14 @@
     </w:p>
     <w:p/>
     <w:p>
-      <w:proofErr w:type="gramStart"/>
-      <w:r>
-        <w:t>Prefiere tecnología o papel?</w:t>
-      </w:r>
-      <w:proofErr w:type="gramEnd"/>
-      <w:r>
-        <w:t xml:space="preserve"> </w:t>
-      </w:r>
-      <w:proofErr w:type="gramStart"/>
-      <w:r>
-        <w:t>Le molesta llevar dispositivos?</w:t>
-      </w:r>
-      <w:proofErr w:type="gramEnd"/>
-      <w:r>
-        <w:t xml:space="preserve"> </w:t>
-      </w:r>
-      <w:proofErr w:type="gramStart"/>
-      <w:r>
-        <w:t>Quiere voz sintética o no?</w:t>
-      </w:r>
-      <w:proofErr w:type="gramEnd"/>
-      <w:r>
-        <w:t xml:space="preserve"> Esto no </w:t>
-      </w:r>
-      <w:proofErr w:type="gramStart"/>
-      <w:r>
-        <w:t>filtra</w:t>
-      </w:r>
-      <w:proofErr w:type="gramEnd"/>
-      <w:r>
-        <w:t xml:space="preserve"> sino que pondera</w:t>
+      <w:r>
+        <w:t>Prefiere tecnología o papel? Le molesta llevar dispositivos? Quiere voz sintética o no? Esto no filtra sino que pondera</w:t>
       </w:r>
     </w:p>
     <w:p/>
     <w:p>
-      <w:proofErr w:type="gramStart"/>
-      <w:r>
-        <w:t>manual Test</w:t>
-      </w:r>
-      <w:proofErr w:type="gramEnd"/>
-      <w:r>
-        <w:t xml:space="preserve"> COMFOR</w:t>
+      <w:r>
+        <w:t>manual Test COMFOR</w:t>
       </w:r>
       <w:r>
         <w:t xml:space="preserve">. </w:t>
@@ -1456,13 +1373,8 @@
         <w:t xml:space="preserve"> </w:t>
       </w:r>
       <w:r>
-        <w:t xml:space="preserve">en el que los pictogramas simbolizan funciones del lenguaje (“tengo que contarte algo”; “quiero hablar de otro tema”; “pasa la </w:t>
-      </w:r>
-      <w:proofErr w:type="gramStart"/>
-      <w:r>
-        <w:t>página”…</w:t>
-      </w:r>
-      <w:proofErr w:type="gramEnd"/>
+        <w:t>en el que los pictogramas simbolizan funciones del lenguaje (“tengo que contarte algo”; “quiero hablar de otro tema”; “pasa la página”…</w:t>
+      </w:r>
     </w:p>
     <w:p>
       <w:pPr>
@@ -1942,13 +1854,8 @@
       </w:r>
     </w:p>
     <w:p>
-      <w:proofErr w:type="gramStart"/>
-      <w:r>
-        <w:t>Especificar</w:t>
-      </w:r>
-      <w:proofErr w:type="gramEnd"/>
-      <w:r>
-        <w:t xml:space="preserve"> que nos centramos en los asistidos o con ayuda ya que para hablar por gestos no hace falta q nadie te diga </w:t>
+      <w:r>
+        <w:t xml:space="preserve">Especificar que nos centramos en los asistidos o con ayuda ya que para hablar por gestos no hace falta q nadie te diga </w:t>
       </w:r>
       <w:proofErr w:type="spellStart"/>
       <w:r>
@@ -5296,29 +5203,16 @@
                 <w14:ligatures w14:val="none"/>
               </w:rPr>
             </w:pPr>
-            <w:proofErr w:type="gramStart"/>
-            <w:r>
-              <w:rPr>
-                <w:rFonts w:ascii="Times New Roman" w:eastAsia="Times New Roman" w:hAnsi="Times New Roman" w:cs="Times New Roman"/>
-                <w:kern w:val="0"/>
-                <w:sz w:val="14"/>
-                <w:szCs w:val="14"/>
-                <w:lang w:eastAsia="es-ES"/>
-                <w14:ligatures w14:val="none"/>
-              </w:rPr>
-              <w:t>Look</w:t>
-            </w:r>
-            <w:proofErr w:type="gramEnd"/>
-            <w:r>
-              <w:rPr>
-                <w:rFonts w:ascii="Times New Roman" w:eastAsia="Times New Roman" w:hAnsi="Times New Roman" w:cs="Times New Roman"/>
-                <w:kern w:val="0"/>
-                <w:sz w:val="14"/>
-                <w:szCs w:val="14"/>
-                <w:lang w:eastAsia="es-ES"/>
-                <w14:ligatures w14:val="none"/>
-              </w:rPr>
-              <w:t xml:space="preserve"> </w:t>
+            <w:r>
+              <w:rPr>
+                <w:rFonts w:ascii="Times New Roman" w:eastAsia="Times New Roman" w:hAnsi="Times New Roman" w:cs="Times New Roman"/>
+                <w:kern w:val="0"/>
+                <w:sz w:val="14"/>
+                <w:szCs w:val="14"/>
+                <w:lang w:eastAsia="es-ES"/>
+                <w14:ligatures w14:val="none"/>
+              </w:rPr>
+              <w:t xml:space="preserve">Look </w:t>
             </w:r>
             <w:proofErr w:type="spellStart"/>
             <w:r>
@@ -7008,21 +6902,8 @@
                 <w:lang w:eastAsia="es-ES"/>
                 <w14:ligatures w14:val="none"/>
               </w:rPr>
-              <w:t xml:space="preserve">Comunicador </w:t>
-            </w:r>
-            <w:proofErr w:type="gramStart"/>
-            <w:r>
-              <w:rPr>
-                <w:rFonts w:ascii="Times New Roman" w:eastAsia="Times New Roman" w:hAnsi="Times New Roman" w:cs="Times New Roman"/>
-                <w:kern w:val="0"/>
-                <w:sz w:val="14"/>
-                <w:szCs w:val="14"/>
-                <w:lang w:eastAsia="es-ES"/>
-                <w14:ligatures w14:val="none"/>
-              </w:rPr>
-              <w:t>app</w:t>
-            </w:r>
-            <w:proofErr w:type="gramEnd"/>
+              <w:t>Comunicador app</w:t>
+            </w:r>
           </w:p>
         </w:tc>
         <w:tc>
@@ -10360,11 +10241,9 @@
             <w:tcW w:w="1699" w:type="dxa"/>
           </w:tcPr>
           <w:p>
-            <w:proofErr w:type="gramStart"/>
             <w:r>
               <w:t>Link</w:t>
             </w:r>
-            <w:proofErr w:type="gramEnd"/>
           </w:p>
         </w:tc>
         <w:tc>
@@ -10672,27 +10551,22 @@
             <w:tcW w:w="1698" w:type="dxa"/>
           </w:tcPr>
           <w:p>
-            <w:proofErr w:type="gramStart"/>
-            <w:r>
-              <w:t>Look</w:t>
-            </w:r>
-            <w:proofErr w:type="gramEnd"/>
+            <w:r>
+              <w:t xml:space="preserve">Look </w:t>
+            </w:r>
+            <w:proofErr w:type="spellStart"/>
+            <w:r>
+              <w:t>to</w:t>
+            </w:r>
+            <w:proofErr w:type="spellEnd"/>
             <w:r>
               <w:t xml:space="preserve"> </w:t>
             </w:r>
             <w:proofErr w:type="spellStart"/>
             <w:r>
-              <w:t>to</w:t>
+              <w:t>speak</w:t>
             </w:r>
             <w:proofErr w:type="spellEnd"/>
-            <w:r>
-              <w:t xml:space="preserve"> </w:t>
-            </w:r>
-            <w:proofErr w:type="spellStart"/>
-            <w:r>
-              <w:t>speak</w:t>
-            </w:r>
-            <w:proofErr w:type="spellEnd"/>
           </w:p>
         </w:tc>
         <w:tc>
@@ -10701,13 +10575,8 @@
           </w:tcPr>
           <w:p>
             <w:r>
-              <w:t xml:space="preserve">Gratis </w:t>
-            </w:r>
-            <w:proofErr w:type="gramStart"/>
-            <w:r>
-              <w:t>app</w:t>
-            </w:r>
-            <w:proofErr w:type="gramEnd"/>
+              <w:t>Gratis app</w:t>
+            </w:r>
           </w:p>
         </w:tc>
         <w:tc>
@@ -10748,13 +10617,8 @@
           </w:tcPr>
           <w:p>
             <w:r>
-              <w:t xml:space="preserve">Gratis </w:t>
-            </w:r>
-            <w:proofErr w:type="gramStart"/>
-            <w:r>
-              <w:t>app</w:t>
-            </w:r>
-            <w:proofErr w:type="gramEnd"/>
+              <w:t>Gratis app</w:t>
+            </w:r>
           </w:p>
         </w:tc>
         <w:tc>
@@ -11121,13 +10985,8 @@
             <w:tcW w:w="1698" w:type="dxa"/>
           </w:tcPr>
           <w:p>
-            <w:proofErr w:type="gramStart"/>
-            <w:r>
-              <w:t>Look</w:t>
-            </w:r>
-            <w:proofErr w:type="gramEnd"/>
-            <w:r>
-              <w:t xml:space="preserve"> </w:t>
+            <w:r>
+              <w:t xml:space="preserve">Look </w:t>
             </w:r>
             <w:proofErr w:type="spellStart"/>
             <w:r>
@@ -12104,13 +11963,8 @@
           <w:numId w:val="13"/>
         </w:numPr>
       </w:pPr>
-      <w:proofErr w:type="gramStart"/>
-      <w:r>
-        <w:t>Tiempo(</w:t>
-      </w:r>
-      <w:proofErr w:type="gramEnd"/>
-      <w:r>
-        <w:t>?</w:t>
+      <w:r>
+        <w:t>Tiempo(?</w:t>
       </w:r>
     </w:p>
     <w:p>
@@ -12240,15 +12094,7 @@
     </w:p>
     <w:p>
       <w:r>
-        <w:t xml:space="preserve">Sistema de comunicación por intercambio de imágenes. Parece que no se aplica tanto en ELA como en niños con autismo, puede que sea algo </w:t>
-      </w:r>
-      <w:proofErr w:type="gramStart"/>
-      <w:r>
-        <w:t>infantilizado</w:t>
-      </w:r>
-      <w:proofErr w:type="gramEnd"/>
-      <w:r>
-        <w:t xml:space="preserve"> pero se podría valorar con personas con bajo nivel cognitivo?</w:t>
+        <w:t>Sistema de comunicación por intercambio de imágenes. Parece que no se aplica tanto en ELA como en niños con autismo, puede que sea algo infantilizado pero se podría valorar con personas con bajo nivel cognitivo?</w:t>
       </w:r>
     </w:p>
     <w:p>
@@ -12288,11 +12134,7 @@
       </w:r>
       <w:r>
         <w:lastRenderedPageBreak/>
-        <w:t xml:space="preserve">combinan y modifican para formar mensajes completos, en SPC se selecciona directamente el pictograma. </w:t>
-      </w:r>
-      <w:proofErr w:type="gramStart"/>
-      <w:r>
-        <w:t xml:space="preserve">Puede parecer que SPC en general es </w:t>
+        <w:t xml:space="preserve">combinan y modifican para formar mensajes completos, en SPC se selecciona directamente el pictograma. Puede parecer que SPC en general es </w:t>
       </w:r>
       <w:proofErr w:type="spellStart"/>
       <w:r>
@@ -12308,11 +12150,7 @@
       </w:r>
       <w:proofErr w:type="spellEnd"/>
       <w:r>
-        <w:t xml:space="preserve"> intuitivos, pero puede que se quede algo corto al ser pictogramas directos y no combinación?</w:t>
-      </w:r>
-      <w:proofErr w:type="gramEnd"/>
-      <w:r>
-        <w:t xml:space="preserve"> El SPC es </w:t>
+        <w:t xml:space="preserve"> intuitivos, pero puede que se quede algo corto al ser pictogramas directos y no combinación? El SPC es </w:t>
       </w:r>
       <w:proofErr w:type="spellStart"/>
       <w:r>
@@ -12597,6 +12435,19 @@
             <w:rStyle w:val="Hipervnculo"/>
           </w:rPr>
           <w:t>https://www.plenainclusion.org/discapacidad-intelectual/recurso/sistemas-alternativos-y-aumentativos-de-comunicacion/</w:t>
+        </w:r>
+      </w:hyperlink>
+      <w:r>
+        <w:t xml:space="preserve"> </w:t>
+      </w:r>
+    </w:p>
+    <w:p>
+      <w:hyperlink r:id="rId26" w:history="1">
+        <w:r>
+          <w:rPr>
+            <w:rStyle w:val="Hipervnculo"/>
+          </w:rPr>
+          <w:t>https://catalogoceapat.imserso.es/productos/categorias/variascategorias</w:t>
         </w:r>
       </w:hyperlink>
       <w:r>

</xml_diff>